<commit_message>
fix(weather): add esp32 live data flow
</commit_message>
<xml_diff>
--- a/reports/实验报告.docx
+++ b/reports/实验报告.docx
@@ -2,7 +2,7 @@
 <file path=word/document.xml><?xml version="1.0" encoding="utf-8"?>
 <w:document xmlns:w="http://schemas.openxmlformats.org/wordprocessingml/2006/main" xmlns:m="http://schemas.openxmlformats.org/officeDocument/2006/math" xmlns:r="http://schemas.openxmlformats.org/officeDocument/2006/relationships" xmlns:o="urn:schemas-microsoft-com:office:office" xmlns:v="urn:schemas-microsoft-com:vml" xmlns:w10="urn:schemas-microsoft-com:office:word" xmlns:a="http://schemas.openxmlformats.org/drawingml/2006/main" xmlns:pic="http://schemas.openxmlformats.org/drawingml/2006/picture" xmlns:wp="http://schemas.openxmlformats.org/drawingml/2006/wordprocessingDrawing">
   <w:body>
-    <w:bookmarkStart w:id="32" w:name="气象大数据采集分析与可视化系统实验报告"/>
+    <w:bookmarkStart w:id="33" w:name="气象大数据采集分析与可视化系统实验报告"/>
     <w:p>
       <w:pPr>
         <w:pStyle w:val="Heading1"/>
@@ -75,46 +75,124 @@
         <w:rPr>
           <w:rFonts w:hint="eastAsia"/>
         </w:rPr>
-        <w:t xml:space="preserve">本轮整理时未连接</w:t>
-      </w:r>
-      <w:r>
-        <w:t xml:space="preserve"> ESP32-C3 </w:t>
-      </w:r>
-      <w:r>
-        <w:rPr>
-          <w:rFonts w:hint="eastAsia"/>
-        </w:rPr>
-        <w:t xml:space="preserve">实机，因此没有重新进行固件刷写、DHT11</w:t>
-      </w:r>
-      <w:r>
-        <w:t xml:space="preserve"> </w:t>
-      </w:r>
-      <w:r>
-        <w:rPr>
-          <w:rFonts w:hint="eastAsia"/>
-        </w:rPr>
-        <w:t xml:space="preserve">现场读数和串口采样。除实机复测外，代码、数据路径、表名、接口、前端页面和报告口径均已按设计文档对齐。唐山当前温湿度继续使用仓库中已保留的</w:t>
-      </w:r>
-      <w:r>
-        <w:t xml:space="preserve"> ESP32 USB </w:t>
-      </w:r>
-      <w:r>
-        <w:rPr>
-          <w:rFonts w:hint="eastAsia"/>
-        </w:rPr>
-        <w:t xml:space="preserve">样本，气压、风速、风向和天气代码来自</w:t>
-      </w:r>
-      <w:r>
-        <w:t xml:space="preserve"> </w:t>
-      </w:r>
-      <w:r>
-        <w:rPr>
-          <w:rFonts w:hint="eastAsia"/>
-        </w:rPr>
-        <w:t xml:space="preserve">Open-Meteo；北京、上海全部当前指标来自</w:t>
-      </w:r>
-      <w:r>
-        <w:t xml:space="preserve"> Open-Meteo。</w:t>
+        <w:t xml:space="preserve">系统按设计文档补齐了在线采集服务：ESP32-C3</w:t>
+      </w:r>
+      <w:r>
+        <w:t xml:space="preserve"> </w:t>
+      </w:r>
+      <w:r>
+        <w:rPr>
+          <w:rFonts w:hint="eastAsia"/>
+        </w:rPr>
+        <w:t xml:space="preserve">通过</w:t>
+      </w:r>
+      <w:r>
+        <w:t xml:space="preserve"> Wi-Fi </w:t>
+      </w:r>
+      <w:r>
+        <w:rPr>
+          <w:rFonts w:hint="eastAsia"/>
+        </w:rPr>
+        <w:t xml:space="preserve">接入手机热点后，在</w:t>
+      </w:r>
+      <w:r>
+        <w:t xml:space="preserve"> 8080 </w:t>
+      </w:r>
+      <w:r>
+        <w:rPr>
+          <w:rFonts w:hint="eastAsia"/>
+        </w:rPr>
+        <w:t xml:space="preserve">端口提供</w:t>
+      </w:r>
+      <w:r>
+        <w:t xml:space="preserve"> TCP CSV </w:t>
+      </w:r>
+      <w:r>
+        <w:rPr>
+          <w:rFonts w:hint="eastAsia"/>
+        </w:rPr>
+        <w:t xml:space="preserve">数据；Python</w:t>
+      </w:r>
+      <w:r>
+        <w:t xml:space="preserve"> </w:t>
+      </w:r>
+      <w:r>
+        <w:rPr>
+          <w:rFonts w:hint="eastAsia"/>
+        </w:rPr>
+        <w:t xml:space="preserve">采集服务连接</w:t>
+      </w:r>
+      <w:r>
+        <w:t xml:space="preserve"> </w:t>
+      </w:r>
+      <w:r>
+        <w:rPr>
+          <w:rFonts w:hint="eastAsia"/>
+        </w:rPr>
+        <w:t xml:space="preserve">ESP32，合并</w:t>
+      </w:r>
+      <w:r>
+        <w:t xml:space="preserve"> Open-Meteo </w:t>
+      </w:r>
+      <w:r>
+        <w:rPr>
+          <w:rFonts w:hint="eastAsia"/>
+        </w:rPr>
+        <w:t xml:space="preserve">当前气压、风速、风向和天气代码，并把实时记录写入</w:t>
+      </w:r>
+      <w:r>
+        <w:t xml:space="preserve"> HBase </w:t>
+      </w:r>
+      <w:r>
+        <w:rPr>
+          <w:rFonts w:hint="eastAsia"/>
+        </w:rPr>
+        <w:t xml:space="preserve">与</w:t>
+      </w:r>
+      <w:r>
+        <w:t xml:space="preserve"> </w:t>
+      </w:r>
+      <w:r>
+        <w:rPr>
+          <w:rFonts w:hint="eastAsia"/>
+        </w:rPr>
+        <w:t xml:space="preserve">HDFS。当前实物已验证</w:t>
+      </w:r>
+      <w:r>
+        <w:t xml:space="preserve"> DHT11 </w:t>
+      </w:r>
+      <w:r>
+        <w:rPr>
+          <w:rFonts w:hint="eastAsia"/>
+        </w:rPr>
+        <w:t xml:space="preserve">在</w:t>
+      </w:r>
+      <w:r>
+        <w:t xml:space="preserve"> GPIO4 </w:t>
+      </w:r>
+      <w:r>
+        <w:rPr>
+          <w:rFonts w:hint="eastAsia"/>
+        </w:rPr>
+        <w:t xml:space="preserve">可稳定读取温湿度，热点互访能力已验证，ESP32</w:t>
+      </w:r>
+      <w:r>
+        <w:t xml:space="preserve"> </w:t>
+      </w:r>
+      <w:r>
+        <w:rPr>
+          <w:rFonts w:hint="eastAsia"/>
+        </w:rPr>
+        <w:t xml:space="preserve">气象站</w:t>
+      </w:r>
+      <w:r>
+        <w:t xml:space="preserve"> TCP </w:t>
+      </w:r>
+      <w:r>
+        <w:rPr>
+          <w:rFonts w:hint="eastAsia"/>
+        </w:rPr>
+        <w:t xml:space="preserve">服务已输出真实温湿度样本。</w:t>
       </w:r>
     </w:p>
     <w:p>
@@ -229,25 +307,61 @@
               <w:rPr>
                 <w:rFonts w:hint="eastAsia"/>
               </w:rPr>
-              <w:t xml:space="preserve">实机未连接，本轮不复测；保留</w:t>
-            </w:r>
-            <w:r>
-              <w:t xml:space="preserve"> ESP32 </w:t>
-            </w:r>
-            <w:r>
-              <w:rPr>
-                <w:rFonts w:hint="eastAsia"/>
-              </w:rPr>
-              <w:t xml:space="preserve">脚本和历史</w:t>
-            </w:r>
-            <w:r>
-              <w:t xml:space="preserve"> USB </w:t>
-            </w:r>
-            <w:r>
-              <w:rPr>
-                <w:rFonts w:hint="eastAsia"/>
-              </w:rPr>
-              <w:t xml:space="preserve">样本</w:t>
+              <w:t xml:space="preserve">已提供</w:t>
+            </w:r>
+            <w:r>
+              <w:t xml:space="preserve"> Wi-Fi/TCP </w:t>
+            </w:r>
+            <w:r>
+              <w:rPr>
+                <w:rFonts w:hint="eastAsia"/>
+              </w:rPr>
+              <w:t xml:space="preserve">气象站脚本；实物</w:t>
+            </w:r>
+            <w:r>
+              <w:t xml:space="preserve"> DHT11 </w:t>
+            </w:r>
+            <w:r>
+              <w:rPr>
+                <w:rFonts w:hint="eastAsia"/>
+              </w:rPr>
+              <w:t xml:space="preserve">在</w:t>
+            </w:r>
+            <w:r>
+              <w:t xml:space="preserve"> GPIO4 </w:t>
+            </w:r>
+            <w:r>
+              <w:rPr>
+                <w:rFonts w:hint="eastAsia"/>
+              </w:rPr>
+              <w:t xml:space="preserve">读取到</w:t>
+            </w:r>
+            <w:r>
+              <w:t xml:space="preserve"> 24 </w:t>
+            </w:r>
+            <w:r>
+              <w:rPr>
+                <w:rFonts w:hint="eastAsia"/>
+              </w:rPr>
+              <w:t xml:space="preserve">摄氏度、37%</w:t>
+            </w:r>
+            <w:r>
+              <w:t xml:space="preserve"> </w:t>
+            </w:r>
+            <w:r>
+              <w:rPr>
+                <w:rFonts w:hint="eastAsia"/>
+              </w:rPr>
+              <w:t xml:space="preserve">到</w:t>
+            </w:r>
+            <w:r>
+              <w:t xml:space="preserve"> 38% </w:t>
+            </w:r>
+            <w:r>
+              <w:rPr>
+                <w:rFonts w:hint="eastAsia"/>
+              </w:rPr>
+              <w:t xml:space="preserve">湿度</w:t>
             </w:r>
           </w:p>
         </w:tc>
@@ -397,6 +511,15 @@
               <w:t xml:space="preserve">已上传本项目历史</w:t>
             </w:r>
             <w:r>
+              <w:t xml:space="preserve"> </w:t>
+            </w:r>
+            <w:r>
+              <w:rPr>
+                <w:rFonts w:hint="eastAsia"/>
+              </w:rPr>
+              <w:t xml:space="preserve">CSV；在线采集服务支持批量追加实时</w:t>
+            </w:r>
+            <w:r>
               <w:t xml:space="preserve"> CSV</w:t>
             </w:r>
           </w:p>
@@ -489,45 +612,90 @@
               <w:pStyle w:val="Compact"/>
             </w:pPr>
             <w:r>
+              <w:t xml:space="preserve">Hive </w:t>
+            </w:r>
+            <w:r>
+              <w:rPr>
+                <w:rFonts w:hint="eastAsia"/>
+              </w:rPr>
+              <w:t xml:space="preserve">表输入、YARN</w:t>
+            </w:r>
+            <w:r>
+              <w:t xml:space="preserve"> </w:t>
+            </w:r>
+            <w:r>
+              <w:rPr>
+                <w:rFonts w:hint="eastAsia"/>
+              </w:rPr>
+              <w:t xml:space="preserve">提交、10</w:t>
+            </w:r>
+            <w:r>
+              <w:t xml:space="preserve"> </w:t>
+            </w:r>
+            <w:r>
+              <w:rPr>
+                <w:rFonts w:hint="eastAsia"/>
+              </w:rPr>
+              <w:t xml:space="preserve">秒窗口均值</w:t>
+            </w:r>
+          </w:p>
+        </w:tc>
+        <w:tc>
+          <w:tcPr/>
+          <w:p>
+            <w:pPr>
+              <w:pStyle w:val="Compact"/>
+            </w:pPr>
+            <w:r>
+              <w:rPr>
+                <w:rFonts w:hint="eastAsia"/>
+              </w:rPr>
+              <w:t xml:space="preserve">已支持</w:t>
+            </w:r>
+            <w:r>
+              <w:t xml:space="preserve"> </w:t>
+            </w:r>
+            <w:r>
               <w:rPr>
                 <w:rStyle w:val="VerbatimChar"/>
               </w:rPr>
+              <w:t xml:space="preserve">--source hive</w:t>
+            </w:r>
+            <w:r>
+              <w:t xml:space="preserve">、</w:t>
+            </w:r>
+            <w:r>
+              <w:rPr>
+                <w:rStyle w:val="VerbatimChar"/>
+              </w:rPr>
+              <w:t xml:space="preserve">--master yarn</w:t>
+            </w:r>
+            <w:r>
+              <w:t xml:space="preserve">、</w:t>
+            </w:r>
+            <w:r>
+              <w:rPr>
+                <w:rStyle w:val="VerbatimChar"/>
+              </w:rPr>
               <w:t xml:space="preserve">/weather_analysis/window_mean</w:t>
             </w:r>
             <w:r>
-              <w:t xml:space="preserve">、</w:t>
+              <w:t xml:space="preserve"> </w:t>
+            </w:r>
+            <w:r>
+              <w:rPr>
+                <w:rFonts w:hint="eastAsia"/>
+              </w:rPr>
+              <w:t xml:space="preserve">和</w:t>
+            </w:r>
+            <w:r>
+              <w:t xml:space="preserve"> </w:t>
             </w:r>
             <w:r>
               <w:rPr>
                 <w:rStyle w:val="VerbatimChar"/>
               </w:rPr>
-              <w:t xml:space="preserve">/weather_analysis/summary</w:t>
-            </w:r>
-          </w:p>
-        </w:tc>
-        <w:tc>
-          <w:tcPr/>
-          <w:p>
-            <w:pPr>
-              <w:pStyle w:val="Compact"/>
-            </w:pPr>
-            <w:r>
-              <w:rPr>
-                <w:rFonts w:hint="eastAsia"/>
-              </w:rPr>
-              <w:t xml:space="preserve">已生成</w:t>
-            </w:r>
-            <w:r>
-              <w:t xml:space="preserve"> HDFS </w:t>
-            </w:r>
-            <w:r>
-              <w:rPr>
-                <w:rFonts w:hint="eastAsia"/>
-              </w:rPr>
-              <w:t xml:space="preserve">输出和本地</w:t>
-            </w:r>
-            <w:r>
-              <w:t xml:space="preserve"> JSON</w:t>
+              <w:t xml:space="preserve">/weather_10secmean</w:t>
             </w:r>
           </w:p>
         </w:tc>
@@ -571,19 +739,46 @@
               </w:rPr>
               <w:t xml:space="preserve">data</w:t>
             </w:r>
-          </w:p>
-        </w:tc>
-        <w:tc>
-          <w:tcPr/>
-          <w:p>
-            <w:pPr>
-              <w:pStyle w:val="Compact"/>
-            </w:pPr>
-            <w:r>
-              <w:rPr>
-                <w:rFonts w:hint="eastAsia"/>
-              </w:rPr>
-              <w:t xml:space="preserve">已写入三站当前数据</w:t>
+            <w:r>
+              <w:rPr>
+                <w:rFonts w:hint="eastAsia"/>
+              </w:rPr>
+              <w:t xml:space="preserve">，短期</w:t>
+            </w:r>
+            <w:r>
+              <w:t xml:space="preserve"> TTL</w:t>
+            </w:r>
+          </w:p>
+        </w:tc>
+        <w:tc>
+          <w:tcPr/>
+          <w:p>
+            <w:pPr>
+              <w:pStyle w:val="Compact"/>
+            </w:pPr>
+            <w:r>
+              <w:rPr>
+                <w:rFonts w:hint="eastAsia"/>
+              </w:rPr>
+              <w:t xml:space="preserve">已写入三站当前数据；脚本设置</w:t>
+            </w:r>
+            <w:r>
+              <w:t xml:space="preserve"> TTL </w:t>
+            </w:r>
+            <w:r>
+              <w:rPr>
+                <w:rFonts w:hint="eastAsia"/>
+              </w:rPr>
+              <w:t xml:space="preserve">为</w:t>
+            </w:r>
+            <w:r>
+              <w:t xml:space="preserve"> 150 </w:t>
+            </w:r>
+            <w:r>
+              <w:rPr>
+                <w:rFonts w:hint="eastAsia"/>
+              </w:rPr>
+              <w:t xml:space="preserve">秒</w:t>
             </w:r>
           </w:p>
         </w:tc>
@@ -621,7 +816,28 @@
               <w:rPr>
                 <w:rFonts w:hint="eastAsia"/>
               </w:rPr>
-              <w:t xml:space="preserve">已提供设计文档接口</w:t>
+              <w:t xml:space="preserve">已提供设计文档接口；当前数据优先读取</w:t>
+            </w:r>
+            <w:r>
+              <w:t xml:space="preserve"> </w:t>
+            </w:r>
+            <w:r>
+              <w:rPr>
+                <w:rFonts w:hint="eastAsia"/>
+              </w:rPr>
+              <w:t xml:space="preserve">HBase，失败时回退到实时</w:t>
+            </w:r>
+            <w:r>
+              <w:t xml:space="preserve"> CSV </w:t>
+            </w:r>
+            <w:r>
+              <w:rPr>
+                <w:rFonts w:hint="eastAsia"/>
+              </w:rPr>
+              <w:t xml:space="preserve">和本地</w:t>
+            </w:r>
+            <w:r>
+              <w:t xml:space="preserve"> JSON</w:t>
             </w:r>
           </w:p>
         </w:tc>
@@ -736,7 +952,7 @@
         <w:rPr>
           <w:rFonts w:hint="eastAsia"/>
         </w:rPr>
-        <w:t xml:space="preserve">提供。合并后的三站当前记录写入</w:t>
+        <w:t xml:space="preserve">提供。在线采集服务把唐山实时记录写入</w:t>
       </w:r>
       <w:r>
         <w:t xml:space="preserve"> HBase </w:t>
@@ -757,19 +973,40 @@
         <w:t xml:space="preserve">realtime_weather</w:t>
       </w:r>
       <w:r>
-        <w:rPr>
-          <w:rFonts w:hint="eastAsia"/>
-        </w:rPr>
-        <w:t xml:space="preserve">，FastAPI</w:t>
-      </w:r>
-      <w:r>
-        <w:t xml:space="preserve"> </w:t>
-      </w:r>
-      <w:r>
-        <w:rPr>
-          <w:rFonts w:hint="eastAsia"/>
-        </w:rPr>
-        <w:t xml:space="preserve">将其作为总览页站点读数。</w:t>
+        <w:t xml:space="preserve"> </w:t>
+      </w:r>
+      <w:r>
+        <w:rPr>
+          <w:rFonts w:hint="eastAsia"/>
+        </w:rPr>
+        <w:t xml:space="preserve">与</w:t>
+      </w:r>
+      <w:r>
+        <w:t xml:space="preserve"> </w:t>
+      </w:r>
+      <w:r>
+        <w:rPr>
+          <w:rFonts w:hint="eastAsia"/>
+        </w:rPr>
+        <w:t xml:space="preserve">HDFS，离线当前数据脚本可把三站当前快照写入同一张</w:t>
+      </w:r>
+      <w:r>
+        <w:t xml:space="preserve"> HBase </w:t>
+      </w:r>
+      <w:r>
+        <w:rPr>
+          <w:rFonts w:hint="eastAsia"/>
+        </w:rPr>
+        <w:t xml:space="preserve">表，FastAPI</w:t>
+      </w:r>
+      <w:r>
+        <w:t xml:space="preserve"> </w:t>
+      </w:r>
+      <w:r>
+        <w:rPr>
+          <w:rFonts w:hint="eastAsia"/>
+        </w:rPr>
+        <w:t xml:space="preserve">将其作为总览页站点读数的优先来源。</w:t>
       </w:r>
     </w:p>
     <w:p>
@@ -899,33 +1136,7 @@
         <w:rPr>
           <w:rStyle w:val="VerbatimChar"/>
         </w:rPr>
-        <w:t xml:space="preserve">    | USB </w:t>
-      </w:r>
-      <w:r>
-        <w:rPr>
-          <w:rStyle w:val="VerbatimChar"/>
-          <w:rFonts w:hint="eastAsia"/>
-        </w:rPr>
-        <w:t xml:space="preserve">串口样本</w:t>
-      </w:r>
-      <w:r>
-        <w:rPr>
-          <w:rStyle w:val="VerbatimChar"/>
-        </w:rPr>
-        <w:t xml:space="preserve"> / </w:t>
-      </w:r>
-      <w:r>
-        <w:rPr>
-          <w:rStyle w:val="VerbatimChar"/>
-          <w:rFonts w:hint="eastAsia"/>
-        </w:rPr>
-        <w:t xml:space="preserve">实机演示时可切</w:t>
-      </w:r>
-      <w:r>
-        <w:rPr>
-          <w:rStyle w:val="VerbatimChar"/>
-        </w:rPr>
-        <w:t xml:space="preserve"> TCP CSV</w:t>
+        <w:t xml:space="preserve">    | Wi-Fi TCP CSV</w:t>
       </w:r>
       <w:r>
         <w:br/>
@@ -1020,7 +1231,20 @@
         <w:rPr>
           <w:rStyle w:val="VerbatimChar"/>
         </w:rPr>
-        <w:t xml:space="preserve">Open-Meteo Historical Weather API</w:t>
+        <w:t xml:space="preserve">Open-Meteo Historical Weather API / </w:t>
+      </w:r>
+      <w:r>
+        <w:rPr>
+          <w:rStyle w:val="VerbatimChar"/>
+          <w:rFonts w:hint="eastAsia"/>
+        </w:rPr>
+        <w:t xml:space="preserve">实时批量</w:t>
+      </w:r>
+      <w:r>
+        <w:rPr>
+          <w:rStyle w:val="VerbatimChar"/>
+        </w:rPr>
+        <w:t xml:space="preserve"> CSV</w:t>
       </w:r>
       <w:r>
         <w:br/>
@@ -1101,7 +1325,7 @@
         <w:rPr>
           <w:rStyle w:val="VerbatimChar"/>
         </w:rPr>
-        <w:t xml:space="preserve">Spark </w:t>
+        <w:t xml:space="preserve">Spark on YARN </w:t>
       </w:r>
       <w:r>
         <w:rPr>
@@ -1135,7 +1359,20 @@
         <w:rPr>
           <w:rStyle w:val="VerbatimChar"/>
         </w:rPr>
-        <w:t xml:space="preserve">HDFS /weather_analysis/*</w:t>
+        <w:t xml:space="preserve">HDFS /weather_analysis/* </w:t>
+      </w:r>
+      <w:r>
+        <w:rPr>
+          <w:rStyle w:val="VerbatimChar"/>
+          <w:rFonts w:hint="eastAsia"/>
+        </w:rPr>
+        <w:t xml:space="preserve">和</w:t>
+      </w:r>
+      <w:r>
+        <w:rPr>
+          <w:rStyle w:val="VerbatimChar"/>
+        </w:rPr>
+        <w:t xml:space="preserve"> /weather_10secmean</w:t>
       </w:r>
       <w:r>
         <w:br/>
@@ -1395,7 +1632,7 @@
               <w:rPr>
                 <w:rFonts w:hint="eastAsia"/>
               </w:rPr>
-              <w:t xml:space="preserve">温湿度样本</w:t>
+              <w:t xml:space="preserve">温湿度</w:t>
             </w:r>
             <w:r>
               <w:t xml:space="preserve"> + Open-Meteo</w:t>
@@ -1533,37 +1770,37 @@
         <w:pStyle w:val="BodyText"/>
       </w:pPr>
       <w:r>
-        <w:rPr>
-          <w:rFonts w:hint="eastAsia"/>
-        </w:rPr>
-        <w:t xml:space="preserve">本轮验收使用的唐山当前温湿度来自</w:t>
-      </w:r>
-      <w:r>
-        <w:t xml:space="preserve"> </w:t>
-      </w:r>
-      <w:r>
-        <w:rPr>
-          <w:rStyle w:val="VerbatimChar"/>
-        </w:rPr>
-        <w:t xml:space="preserve">data/raw/esp32_usb_samples.csv</w:t>
-      </w:r>
-      <w:r>
-        <w:t xml:space="preserve"> </w:t>
-      </w:r>
-      <w:r>
-        <w:rPr>
-          <w:rFonts w:hint="eastAsia"/>
-        </w:rPr>
-        <w:t xml:space="preserve">中已采集样本。由于当前没有连接</w:t>
-      </w:r>
-      <w:r>
-        <w:t xml:space="preserve"> </w:t>
-      </w:r>
-      <w:r>
-        <w:rPr>
-          <w:rFonts w:hint="eastAsia"/>
-        </w:rPr>
-        <w:t xml:space="preserve">ESP32-C3，报告不声称本轮完成了新的实机采样。</w:t>
+        <w:t xml:space="preserve">ESP32 </w:t>
+      </w:r>
+      <w:r>
+        <w:rPr>
+          <w:rFonts w:hint="eastAsia"/>
+        </w:rPr>
+        <w:t xml:space="preserve">的正式演示路径为</w:t>
+      </w:r>
+      <w:r>
+        <w:t xml:space="preserve"> Wi-Fi/TCP。USB </w:t>
+      </w:r>
+      <w:r>
+        <w:rPr>
+          <w:rFonts w:hint="eastAsia"/>
+        </w:rPr>
+        <w:t xml:space="preserve">串口仅用于刷写、上传脚本和读取调试日志；在热点异常时，</w:t>
+      </w:r>
+      <w:r>
+        <w:rPr>
+          <w:rStyle w:val="VerbatimChar"/>
+        </w:rPr>
+        <w:t xml:space="preserve">esp32/usb_weatherstation_main.py</w:t>
+      </w:r>
+      <w:r>
+        <w:t xml:space="preserve"> </w:t>
+      </w:r>
+      <w:r>
+        <w:rPr>
+          <w:rFonts w:hint="eastAsia"/>
+        </w:rPr>
+        <w:t xml:space="preserve">可作为保底采样方式。</w:t>
       </w:r>
     </w:p>
     <w:bookmarkEnd w:id="11"/>
@@ -1991,7 +2228,7 @@
     </w:p>
     <w:bookmarkEnd w:id="12"/>
     <w:bookmarkEnd w:id="13"/>
-    <w:bookmarkStart w:id="18" w:name="四采集与存储实现"/>
+    <w:bookmarkStart w:id="19" w:name="四采集与存储实现"/>
     <w:p>
       <w:pPr>
         <w:pStyle w:val="Heading2"/>
@@ -2136,7 +2373,7 @@
               <w:pStyle w:val="Compact"/>
             </w:pPr>
             <w:r>
-              <w:t xml:space="preserve">GPIO2</w:t>
+              <w:t xml:space="preserve">GPIO4</w:t>
             </w:r>
           </w:p>
         </w:tc>
@@ -2221,44 +2458,320 @@
         <w:rPr>
           <w:rFonts w:hint="eastAsia"/>
         </w:rPr>
-        <w:t xml:space="preserve">本轮没有连接</w:t>
-      </w:r>
-      <w:r>
-        <w:t xml:space="preserve"> </w:t>
-      </w:r>
-      <w:r>
-        <w:rPr>
-          <w:rFonts w:hint="eastAsia"/>
-        </w:rPr>
-        <w:t xml:space="preserve">ESP32-C3，因此只验证非实机部分。唐山当前温湿度仍来自既有</w:t>
-      </w:r>
-      <w:r>
-        <w:t xml:space="preserve"> USB </w:t>
-      </w:r>
-      <w:r>
-        <w:rPr>
-          <w:rFonts w:hint="eastAsia"/>
-        </w:rPr>
-        <w:t xml:space="preserve">样本，后续连接实机后可重新运行串口读取脚本刷新样本文件。</w:t>
+        <w:t xml:space="preserve">上传网络气象站脚本的命令如下，热点密码通过环境变量传入，不写入仓库：</w:t>
+      </w:r>
+    </w:p>
+    <w:p>
+      <w:pPr>
+        <w:pStyle w:val="SourceCode"/>
+      </w:pPr>
+      <w:r>
+        <w:rPr>
+          <w:rStyle w:val="VariableTok"/>
+        </w:rPr>
+        <w:t xml:space="preserve">ESP32_SSID</w:t>
+      </w:r>
+      <w:r>
+        <w:rPr>
+          <w:rStyle w:val="OperatorTok"/>
+        </w:rPr>
+        <w:t xml:space="preserve">=</w:t>
+      </w:r>
+      <w:r>
+        <w:rPr>
+          <w:rStyle w:val="NormalTok"/>
+        </w:rPr>
+        <w:t xml:space="preserve">prometheus </w:t>
+      </w:r>
+      <w:r>
+        <w:rPr>
+          <w:rStyle w:val="VariableTok"/>
+        </w:rPr>
+        <w:t xml:space="preserve">ESP32_WIFI_KEY</w:t>
+      </w:r>
+      <w:r>
+        <w:rPr>
+          <w:rStyle w:val="OperatorTok"/>
+        </w:rPr>
+        <w:t xml:space="preserve">=</w:t>
+      </w:r>
+      <w:r>
+        <w:rPr>
+          <w:rStyle w:val="NormalTok"/>
+        </w:rPr>
+        <w:t xml:space="preserve">abcdefgh </w:t>
+      </w:r>
+      <w:r>
+        <w:rPr>
+          <w:rStyle w:val="ExtensionTok"/>
+        </w:rPr>
+        <w:t xml:space="preserve">./scripts/upload-esp32-weatherstation.sh</w:t>
+      </w:r>
+    </w:p>
+    <w:p>
+      <w:pPr>
+        <w:pStyle w:val="FirstParagraph"/>
+      </w:pPr>
+      <w:r>
+        <w:t xml:space="preserve">ESP32 </w:t>
+      </w:r>
+      <w:r>
+        <w:rPr>
+          <w:rFonts w:hint="eastAsia"/>
+        </w:rPr>
+        <w:t xml:space="preserve">启动后连接热点并监听</w:t>
+      </w:r>
+      <w:r>
+        <w:t xml:space="preserve"> TCP </w:t>
+      </w:r>
+      <w:r>
+        <w:rPr>
+          <w:rFonts w:hint="eastAsia"/>
+        </w:rPr>
+        <w:t xml:space="preserve">8080，向采集服务发送如下格式：</w:t>
+      </w:r>
+    </w:p>
+    <w:p>
+      <w:pPr>
+        <w:pStyle w:val="SourceCode"/>
+      </w:pPr>
+      <w:r>
+        <w:rPr>
+          <w:rStyle w:val="VerbatimChar"/>
+          <w:rFonts w:hint="eastAsia"/>
+        </w:rPr>
+        <w:t xml:space="preserve">tangshan,唐山,24,38,1</w:t>
+      </w:r>
+    </w:p>
+    <w:p>
+      <w:pPr>
+        <w:pStyle w:val="FirstParagraph"/>
+      </w:pPr>
+      <w:r>
+        <w:rPr>
+          <w:rFonts w:hint="eastAsia"/>
+        </w:rPr>
+        <w:t xml:space="preserve">最后一列为</w:t>
+      </w:r>
+      <w:r>
+        <w:t xml:space="preserve"> ESP32 </w:t>
+      </w:r>
+      <w:r>
+        <w:rPr>
+          <w:rFonts w:hint="eastAsia"/>
+        </w:rPr>
+        <w:t xml:space="preserve">侧递增样本号，用于在页面上证明数据来自连续实时采样。DHT11</w:t>
+      </w:r>
+      <w:r>
+        <w:t xml:space="preserve"> </w:t>
+      </w:r>
+      <w:r>
+        <w:rPr>
+          <w:rFonts w:hint="eastAsia"/>
+        </w:rPr>
+        <w:t xml:space="preserve">本身为整数级温湿度传感器，页面以一位小数统一展示格式，但不声称具备小数级测量精度。</w:t>
+      </w:r>
+    </w:p>
+    <w:p>
+      <w:pPr>
+        <w:pStyle w:val="BodyText"/>
+      </w:pPr>
+      <w:r>
+        <w:rPr>
+          <w:rFonts w:hint="eastAsia"/>
+        </w:rPr>
+        <w:t xml:space="preserve">本次实物检查中，GPIO4</w:t>
+      </w:r>
+      <w:r>
+        <w:t xml:space="preserve"> </w:t>
+      </w:r>
+      <w:r>
+        <w:rPr>
+          <w:rFonts w:hint="eastAsia"/>
+        </w:rPr>
+        <w:t xml:space="preserve">上的</w:t>
+      </w:r>
+      <w:r>
+        <w:t xml:space="preserve"> DHT11 </w:t>
+      </w:r>
+      <w:r>
+        <w:rPr>
+          <w:rFonts w:hint="eastAsia"/>
+        </w:rPr>
+        <w:t xml:space="preserve">返回</w:t>
+      </w:r>
+      <w:r>
+        <w:t xml:space="preserve"> 24 </w:t>
+      </w:r>
+      <w:r>
+        <w:rPr>
+          <w:rFonts w:hint="eastAsia"/>
+        </w:rPr>
+        <w:t xml:space="preserve">至</w:t>
+      </w:r>
+      <w:r>
+        <w:t xml:space="preserve"> 26 </w:t>
+      </w:r>
+      <w:r>
+        <w:rPr>
+          <w:rFonts w:hint="eastAsia"/>
+        </w:rPr>
+        <w:t xml:space="preserve">摄氏度、32%</w:t>
+      </w:r>
+      <w:r>
+        <w:t xml:space="preserve"> </w:t>
+      </w:r>
+      <w:r>
+        <w:rPr>
+          <w:rFonts w:hint="eastAsia"/>
+        </w:rPr>
+        <w:t xml:space="preserve">到</w:t>
+      </w:r>
+      <w:r>
+        <w:t xml:space="preserve"> 60% </w:t>
+      </w:r>
+      <w:r>
+        <w:rPr>
+          <w:rFonts w:hint="eastAsia"/>
+        </w:rPr>
+        <w:t xml:space="preserve">湿度；电脑与</w:t>
+      </w:r>
+      <w:r>
+        <w:t xml:space="preserve"> ESP32 </w:t>
+      </w:r>
+      <w:r>
+        <w:rPr>
+          <w:rFonts w:hint="eastAsia"/>
+        </w:rPr>
+        <w:t xml:space="preserve">处在同一热点时，可以通过</w:t>
+      </w:r>
+      <w:r>
+        <w:t xml:space="preserve"> TCP </w:t>
+      </w:r>
+      <w:r>
+        <w:rPr>
+          <w:rFonts w:hint="eastAsia"/>
+        </w:rPr>
+        <w:t xml:space="preserve">建立连接，说明热点不存在</w:t>
+      </w:r>
+      <w:r>
+        <w:t xml:space="preserve"> AP </w:t>
+      </w:r>
+      <w:r>
+        <w:rPr>
+          <w:rFonts w:hint="eastAsia"/>
+        </w:rPr>
+        <w:t xml:space="preserve">隔离。最终联调使用</w:t>
+      </w:r>
+      <w:r>
+        <w:t xml:space="preserve"> </w:t>
+      </w:r>
+      <w:r>
+        <w:rPr>
+          <w:rStyle w:val="VerbatimChar"/>
+        </w:rPr>
+        <w:t xml:space="preserve">prometheus</w:t>
+      </w:r>
+      <w:r>
+        <w:t xml:space="preserve"> </w:t>
+      </w:r>
+      <w:r>
+        <w:rPr>
+          <w:rFonts w:hint="eastAsia"/>
+        </w:rPr>
+        <w:t xml:space="preserve">热点和新密码</w:t>
+      </w:r>
+      <w:r>
+        <w:t xml:space="preserve"> </w:t>
+      </w:r>
+      <w:r>
+        <w:rPr>
+          <w:rStyle w:val="VerbatimChar"/>
+        </w:rPr>
+        <w:t xml:space="preserve">abcdefgh</w:t>
+      </w:r>
+      <w:r>
+        <w:rPr>
+          <w:rFonts w:hint="eastAsia"/>
+        </w:rPr>
+        <w:t xml:space="preserve">，ESP32</w:t>
+      </w:r>
+      <w:r>
+        <w:t xml:space="preserve"> </w:t>
+      </w:r>
+      <w:r>
+        <w:rPr>
+          <w:rFonts w:hint="eastAsia"/>
+        </w:rPr>
+        <w:t xml:space="preserve">获得</w:t>
+      </w:r>
+      <w:r>
+        <w:t xml:space="preserve"> </w:t>
+      </w:r>
+      <w:r>
+        <w:rPr>
+          <w:rStyle w:val="VerbatimChar"/>
+        </w:rPr>
+        <w:t xml:space="preserve">172.21.7.75</w:t>
+      </w:r>
+      <w:r>
+        <w:rPr>
+          <w:rFonts w:hint="eastAsia"/>
+        </w:rPr>
+        <w:t xml:space="preserve">，气象站服务从</w:t>
+      </w:r>
+      <w:r>
+        <w:t xml:space="preserve"> TCP 8080 </w:t>
+      </w:r>
+      <w:r>
+        <w:rPr>
+          <w:rFonts w:hint="eastAsia"/>
+        </w:rPr>
+        <w:t xml:space="preserve">输出</w:t>
+      </w:r>
+      <w:r>
+        <w:t xml:space="preserve"> </w:t>
+      </w:r>
+      <w:r>
+        <w:rPr>
+          <w:rStyle w:val="VerbatimChar"/>
+          <w:rFonts w:hint="eastAsia"/>
+        </w:rPr>
+        <w:t xml:space="preserve">tangshan,唐山,25,32,5</w:t>
+      </w:r>
+      <w:r>
+        <w:t xml:space="preserve"> </w:t>
+      </w:r>
+      <w:r>
+        <w:rPr>
+          <w:rFonts w:hint="eastAsia"/>
+        </w:rPr>
+        <w:t xml:space="preserve">等</w:t>
+      </w:r>
+      <w:r>
+        <w:t xml:space="preserve"> CSV </w:t>
+      </w:r>
+      <w:r>
+        <w:rPr>
+          <w:rFonts w:hint="eastAsia"/>
+        </w:rPr>
+        <w:t xml:space="preserve">记录。</w:t>
       </w:r>
     </w:p>
     <w:bookmarkEnd w:id="14"/>
-    <w:bookmarkStart w:id="15" w:name="hdfs-与-hive"/>
+    <w:bookmarkStart w:id="15" w:name="在线采集服务"/>
     <w:p>
       <w:pPr>
         <w:pStyle w:val="Heading3"/>
       </w:pPr>
       <w:r>
-        <w:t xml:space="preserve">4.2 HDFS </w:t>
-      </w:r>
-      <w:r>
-        <w:rPr>
-          <w:rFonts w:hint="eastAsia"/>
-        </w:rPr>
-        <w:t xml:space="preserve">与</w:t>
-      </w:r>
-      <w:r>
-        <w:t xml:space="preserve"> Hive</w:t>
+        <w:t xml:space="preserve">4.2 </w:t>
+      </w:r>
+      <w:r>
+        <w:rPr>
+          <w:rFonts w:hint="eastAsia"/>
+        </w:rPr>
+        <w:t xml:space="preserve">在线采集服务</w:t>
       </w:r>
     </w:p>
     <w:p>
@@ -2269,25 +2782,76 @@
         <w:rPr>
           <w:rFonts w:hint="eastAsia"/>
         </w:rPr>
-        <w:t xml:space="preserve">历史</w:t>
-      </w:r>
-      <w:r>
-        <w:t xml:space="preserve"> CSV </w:t>
-      </w:r>
-      <w:r>
-        <w:rPr>
-          <w:rFonts w:hint="eastAsia"/>
-        </w:rPr>
-        <w:t xml:space="preserve">上传到设计文档要求的</w:t>
-      </w:r>
-      <w:r>
-        <w:t xml:space="preserve"> HDFS </w:t>
-      </w:r>
-      <w:r>
-        <w:rPr>
-          <w:rFonts w:hint="eastAsia"/>
-        </w:rPr>
-        <w:t xml:space="preserve">路径：</w:t>
+        <w:t xml:space="preserve">在线采集服务位于</w:t>
+      </w:r>
+      <w:r>
+        <w:t xml:space="preserve"> </w:t>
+      </w:r>
+      <w:r>
+        <w:rPr>
+          <w:rStyle w:val="VerbatimChar"/>
+        </w:rPr>
+        <w:t xml:space="preserve">backend/scripts/weather_dataserver.py</w:t>
+      </w:r>
+      <w:r>
+        <w:rPr>
+          <w:rFonts w:hint="eastAsia"/>
+        </w:rPr>
+        <w:t xml:space="preserve">。它连接</w:t>
+      </w:r>
+      <w:r>
+        <w:t xml:space="preserve"> ESP32 </w:t>
+      </w:r>
+      <w:r>
+        <w:rPr>
+          <w:rFonts w:hint="eastAsia"/>
+        </w:rPr>
+        <w:t xml:space="preserve">的</w:t>
+      </w:r>
+      <w:r>
+        <w:t xml:space="preserve"> TCP </w:t>
+      </w:r>
+      <w:r>
+        <w:rPr>
+          <w:rFonts w:hint="eastAsia"/>
+        </w:rPr>
+        <w:t xml:space="preserve">服务，接收温湿度</w:t>
+      </w:r>
+      <w:r>
+        <w:t xml:space="preserve"> </w:t>
+      </w:r>
+      <w:r>
+        <w:rPr>
+          <w:rFonts w:hint="eastAsia"/>
+        </w:rPr>
+        <w:t xml:space="preserve">CSV，并合并</w:t>
+      </w:r>
+      <w:r>
+        <w:t xml:space="preserve"> </w:t>
+      </w:r>
+      <w:r>
+        <w:rPr>
+          <w:rStyle w:val="VerbatimChar"/>
+        </w:rPr>
+        <w:t xml:space="preserve">data/raw/current_weather.json</w:t>
+      </w:r>
+      <w:r>
+        <w:t xml:space="preserve"> </w:t>
+      </w:r>
+      <w:r>
+        <w:rPr>
+          <w:rFonts w:hint="eastAsia"/>
+        </w:rPr>
+        <w:t xml:space="preserve">中的</w:t>
+      </w:r>
+      <w:r>
+        <w:t xml:space="preserve"> Open-Meteo </w:t>
+      </w:r>
+      <w:r>
+        <w:rPr>
+          <w:rFonts w:hint="eastAsia"/>
+        </w:rPr>
+        <w:t xml:space="preserve">当前气象字段，形成统一九列记录：</w:t>
       </w:r>
     </w:p>
     <w:p>
@@ -2296,15 +2860,67 @@
       </w:pPr>
       <w:r>
         <w:rPr>
+          <w:rStyle w:val="VerbatimChar"/>
+        </w:rPr>
+        <w:t xml:space="preserve">collect_time,station_id,station_name,temperature,humidity,pressure,wind_speed,wind_direction,weather_code</w:t>
+      </w:r>
+    </w:p>
+    <w:p>
+      <w:pPr>
+        <w:pStyle w:val="FirstParagraph"/>
+      </w:pPr>
+      <w:r>
+        <w:rPr>
+          <w:rFonts w:hint="eastAsia"/>
+        </w:rPr>
+        <w:t xml:space="preserve">启动命令如下：</w:t>
+      </w:r>
+    </w:p>
+    <w:p>
+      <w:pPr>
+        <w:pStyle w:val="SourceCode"/>
+      </w:pPr>
+      <w:r>
+        <w:rPr>
           <w:rStyle w:val="ExtensionTok"/>
         </w:rPr>
-        <w:t xml:space="preserve">./scripts/upload-weather-to-hdfs.sh</w:t>
+        <w:t xml:space="preserve">python</w:t>
       </w:r>
       <w:r>
         <w:rPr>
           <w:rStyle w:val="NormalTok"/>
         </w:rPr>
-        <w:t xml:space="preserve"> data/raw/weather_observations.csv</w:t>
+        <w:t xml:space="preserve"> backend/scripts/weather_dataserver.py </w:t>
+      </w:r>
+      <w:r>
+        <w:rPr>
+          <w:rStyle w:val="AttributeTok"/>
+        </w:rPr>
+        <w:t xml:space="preserve">--station-host</w:t>
+      </w:r>
+      <w:r>
+        <w:rPr>
+          <w:rStyle w:val="NormalTok"/>
+        </w:rPr>
+        <w:t xml:space="preserve"> </w:t>
+      </w:r>
+      <w:r>
+        <w:rPr>
+          <w:rStyle w:val="OperatorTok"/>
+        </w:rPr>
+        <w:t xml:space="preserve">&lt;</w:t>
+      </w:r>
+      <w:r>
+        <w:rPr>
+          <w:rStyle w:val="NormalTok"/>
+        </w:rPr>
+        <w:t xml:space="preserve">ESP32_IP</w:t>
+      </w:r>
+      <w:r>
+        <w:rPr>
+          <w:rStyle w:val="OperatorTok"/>
+        </w:rPr>
+        <w:t xml:space="preserve">&gt;</w:t>
       </w:r>
     </w:p>
     <w:p>
@@ -2315,510 +2931,7 @@
         <w:rPr>
           <w:rFonts w:hint="eastAsia"/>
         </w:rPr>
-        <w:t xml:space="preserve">上传后</w:t>
-      </w:r>
-      <w:r>
-        <w:t xml:space="preserve"> </w:t>
-      </w:r>
-      <w:r>
-        <w:rPr>
-          <w:rStyle w:val="VerbatimChar"/>
-        </w:rPr>
-        <w:t xml:space="preserve">/weathertextdb</w:t>
-      </w:r>
-      <w:r>
-        <w:t xml:space="preserve"> </w:t>
-      </w:r>
-      <w:r>
-        <w:rPr>
-          <w:rFonts w:hint="eastAsia"/>
-        </w:rPr>
-        <w:t xml:space="preserve">中只保留本项目文件：</w:t>
-      </w:r>
-    </w:p>
-    <w:p>
-      <w:pPr>
-        <w:pStyle w:val="SourceCode"/>
-      </w:pPr>
-      <w:r>
-        <w:rPr>
-          <w:rStyle w:val="VerbatimChar"/>
-        </w:rPr>
-        <w:t xml:space="preserve">/weathertextdb/weather_observations.csv</w:t>
-      </w:r>
-    </w:p>
-    <w:p>
-      <w:pPr>
-        <w:pStyle w:val="FirstParagraph"/>
-      </w:pPr>
-      <w:r>
-        <w:t xml:space="preserve">Hive </w:t>
-      </w:r>
-      <w:r>
-        <w:rPr>
-          <w:rFonts w:hint="eastAsia"/>
-        </w:rPr>
-        <w:t xml:space="preserve">外部表直接引用</w:t>
-      </w:r>
-      <w:r>
-        <w:t xml:space="preserve"> </w:t>
-      </w:r>
-      <w:r>
-        <w:rPr>
-          <w:rStyle w:val="VerbatimChar"/>
-        </w:rPr>
-        <w:t xml:space="preserve">/weathertextdb</w:t>
-      </w:r>
-      <w:r>
-        <w:rPr>
-          <w:rFonts w:hint="eastAsia"/>
-        </w:rPr>
-        <w:t xml:space="preserve">：</w:t>
-      </w:r>
-    </w:p>
-    <w:p>
-      <w:pPr>
-        <w:pStyle w:val="SourceCode"/>
-      </w:pPr>
-      <w:r>
-        <w:rPr>
-          <w:rStyle w:val="KeywordTok"/>
-        </w:rPr>
-        <w:t xml:space="preserve">CREATE</w:t>
-      </w:r>
-      <w:r>
-        <w:rPr>
-          <w:rStyle w:val="NormalTok"/>
-        </w:rPr>
-        <w:t xml:space="preserve"> EXTERNAL </w:t>
-      </w:r>
-      <w:r>
-        <w:rPr>
-          <w:rStyle w:val="KeywordTok"/>
-        </w:rPr>
-        <w:t xml:space="preserve">TABLE</w:t>
-      </w:r>
-      <w:r>
-        <w:rPr>
-          <w:rStyle w:val="NormalTok"/>
-        </w:rPr>
-        <w:t xml:space="preserve"> weather_table (</w:t>
-      </w:r>
-      <w:r>
-        <w:br/>
-      </w:r>
-      <w:r>
-        <w:rPr>
-          <w:rStyle w:val="NormalTok"/>
-        </w:rPr>
-        <w:t xml:space="preserve">  collect_time STRING,</w:t>
-      </w:r>
-      <w:r>
-        <w:br/>
-      </w:r>
-      <w:r>
-        <w:rPr>
-          <w:rStyle w:val="NormalTok"/>
-        </w:rPr>
-        <w:t xml:space="preserve">  station_id STRING,</w:t>
-      </w:r>
-      <w:r>
-        <w:br/>
-      </w:r>
-      <w:r>
-        <w:rPr>
-          <w:rStyle w:val="NormalTok"/>
-        </w:rPr>
-        <w:t xml:space="preserve">  station_name STRING,</w:t>
-      </w:r>
-      <w:r>
-        <w:br/>
-      </w:r>
-      <w:r>
-        <w:rPr>
-          <w:rStyle w:val="NormalTok"/>
-        </w:rPr>
-        <w:t xml:space="preserve">  temperature </w:t>
-      </w:r>
-      <w:r>
-        <w:rPr>
-          <w:rStyle w:val="DataTypeTok"/>
-        </w:rPr>
-        <w:t xml:space="preserve">DOUBLE</w:t>
-      </w:r>
-      <w:r>
-        <w:rPr>
-          <w:rStyle w:val="NormalTok"/>
-        </w:rPr>
-        <w:t xml:space="preserve">,</w:t>
-      </w:r>
-      <w:r>
-        <w:br/>
-      </w:r>
-      <w:r>
-        <w:rPr>
-          <w:rStyle w:val="NormalTok"/>
-        </w:rPr>
-        <w:t xml:space="preserve">  humidity </w:t>
-      </w:r>
-      <w:r>
-        <w:rPr>
-          <w:rStyle w:val="DataTypeTok"/>
-        </w:rPr>
-        <w:t xml:space="preserve">DOUBLE</w:t>
-      </w:r>
-      <w:r>
-        <w:rPr>
-          <w:rStyle w:val="NormalTok"/>
-        </w:rPr>
-        <w:t xml:space="preserve">,</w:t>
-      </w:r>
-      <w:r>
-        <w:br/>
-      </w:r>
-      <w:r>
-        <w:rPr>
-          <w:rStyle w:val="NormalTok"/>
-        </w:rPr>
-        <w:t xml:space="preserve">  pressure </w:t>
-      </w:r>
-      <w:r>
-        <w:rPr>
-          <w:rStyle w:val="DataTypeTok"/>
-        </w:rPr>
-        <w:t xml:space="preserve">DOUBLE</w:t>
-      </w:r>
-      <w:r>
-        <w:rPr>
-          <w:rStyle w:val="NormalTok"/>
-        </w:rPr>
-        <w:t xml:space="preserve">,</w:t>
-      </w:r>
-      <w:r>
-        <w:br/>
-      </w:r>
-      <w:r>
-        <w:rPr>
-          <w:rStyle w:val="NormalTok"/>
-        </w:rPr>
-        <w:t xml:space="preserve">  wind_speed </w:t>
-      </w:r>
-      <w:r>
-        <w:rPr>
-          <w:rStyle w:val="DataTypeTok"/>
-        </w:rPr>
-        <w:t xml:space="preserve">DOUBLE</w:t>
-      </w:r>
-      <w:r>
-        <w:rPr>
-          <w:rStyle w:val="NormalTok"/>
-        </w:rPr>
-        <w:t xml:space="preserve">,</w:t>
-      </w:r>
-      <w:r>
-        <w:br/>
-      </w:r>
-      <w:r>
-        <w:rPr>
-          <w:rStyle w:val="NormalTok"/>
-        </w:rPr>
-        <w:t xml:space="preserve">  wind_direction </w:t>
-      </w:r>
-      <w:r>
-        <w:rPr>
-          <w:rStyle w:val="DataTypeTok"/>
-        </w:rPr>
-        <w:t xml:space="preserve">DOUBLE</w:t>
-      </w:r>
-      <w:r>
-        <w:rPr>
-          <w:rStyle w:val="NormalTok"/>
-        </w:rPr>
-        <w:t xml:space="preserve">,</w:t>
-      </w:r>
-      <w:r>
-        <w:br/>
-      </w:r>
-      <w:r>
-        <w:rPr>
-          <w:rStyle w:val="NormalTok"/>
-        </w:rPr>
-        <w:t xml:space="preserve">  weather_code </w:t>
-      </w:r>
-      <w:r>
-        <w:rPr>
-          <w:rStyle w:val="DataTypeTok"/>
-        </w:rPr>
-        <w:t xml:space="preserve">INT</w:t>
-      </w:r>
-      <w:r>
-        <w:br/>
-      </w:r>
-      <w:r>
-        <w:rPr>
-          <w:rStyle w:val="NormalTok"/>
-        </w:rPr>
-        <w:t xml:space="preserve">)</w:t>
-      </w:r>
-      <w:r>
-        <w:br/>
-      </w:r>
-      <w:r>
-        <w:rPr>
-          <w:rStyle w:val="KeywordTok"/>
-        </w:rPr>
-        <w:t xml:space="preserve">ROW</w:t>
-      </w:r>
-      <w:r>
-        <w:rPr>
-          <w:rStyle w:val="NormalTok"/>
-        </w:rPr>
-        <w:t xml:space="preserve"> FORMAT DELIMITED</w:t>
-      </w:r>
-      <w:r>
-        <w:br/>
-      </w:r>
-      <w:r>
-        <w:rPr>
-          <w:rStyle w:val="NormalTok"/>
-        </w:rPr>
-        <w:t xml:space="preserve">FIELDS TERMINATED </w:t>
-      </w:r>
-      <w:r>
-        <w:rPr>
-          <w:rStyle w:val="KeywordTok"/>
-        </w:rPr>
-        <w:t xml:space="preserve">BY</w:t>
-      </w:r>
-      <w:r>
-        <w:rPr>
-          <w:rStyle w:val="NormalTok"/>
-        </w:rPr>
-        <w:t xml:space="preserve"> </w:t>
-      </w:r>
-      <w:r>
-        <w:rPr>
-          <w:rStyle w:val="StringTok"/>
-        </w:rPr>
-        <w:t xml:space="preserve">','</w:t>
-      </w:r>
-      <w:r>
-        <w:br/>
-      </w:r>
-      <w:r>
-        <w:rPr>
-          <w:rStyle w:val="NormalTok"/>
-        </w:rPr>
-        <w:t xml:space="preserve">LOCATION </w:t>
-      </w:r>
-      <w:r>
-        <w:rPr>
-          <w:rStyle w:val="StringTok"/>
-        </w:rPr>
-        <w:t xml:space="preserve">'/weathertextdb'</w:t>
-      </w:r>
-      <w:r>
-        <w:rPr>
-          <w:rStyle w:val="NormalTok"/>
-        </w:rPr>
-        <w:t xml:space="preserve">;</w:t>
-      </w:r>
-    </w:p>
-    <w:p>
-      <w:pPr>
-        <w:pStyle w:val="FirstParagraph"/>
-      </w:pPr>
-      <w:r>
-        <w:rPr>
-          <w:rFonts w:hint="eastAsia"/>
-        </w:rPr>
-        <w:t xml:space="preserve">验收查询结果显示三个站点记录数一致：</w:t>
-      </w:r>
-    </w:p>
-    <w:tbl>
-      <w:tblPr>
-        <w:tblStyle w:val="Table"/>
-        <w:tblW w:type="auto" w:w="0"/>
-        <w:tblLook w:firstRow="1" w:lastRow="0" w:firstColumn="0" w:lastColumn="0" w:noHBand="0" w:noVBand="0" w:val="0020"/>
-      </w:tblPr>
-      <w:tblGrid>
-        <w:gridCol w:w="3960"/>
-        <w:gridCol w:w="3960"/>
-      </w:tblGrid>
-      <w:tr>
-        <w:trPr>
-          <w:tblHeader w:val="on"/>
-        </w:trPr>
-        <w:tc>
-          <w:tcPr/>
-          <w:p>
-            <w:pPr>
-              <w:pStyle w:val="Compact"/>
-            </w:pPr>
-            <w:r>
-              <w:rPr>
-                <w:rFonts w:hint="eastAsia"/>
-              </w:rPr>
-              <w:t xml:space="preserve">站点</w:t>
-            </w:r>
-          </w:p>
-        </w:tc>
-        <w:tc>
-          <w:tcPr/>
-          <w:p>
-            <w:pPr>
-              <w:pStyle w:val="Compact"/>
-              <w:jc w:val="right"/>
-            </w:pPr>
-            <w:r>
-              <w:rPr>
-                <w:rFonts w:hint="eastAsia"/>
-              </w:rPr>
-              <w:t xml:space="preserve">记录数</w:t>
-            </w:r>
-          </w:p>
-        </w:tc>
-      </w:tr>
-      <w:tr>
-        <w:tc>
-          <w:tcPr/>
-          <w:p>
-            <w:pPr>
-              <w:pStyle w:val="Compact"/>
-            </w:pPr>
-            <w:r>
-              <w:rPr>
-                <w:rFonts w:hint="eastAsia"/>
-              </w:rPr>
-              <w:t xml:space="preserve">上海</w:t>
-            </w:r>
-          </w:p>
-        </w:tc>
-        <w:tc>
-          <w:tcPr/>
-          <w:p>
-            <w:pPr>
-              <w:pStyle w:val="Compact"/>
-              <w:jc w:val="right"/>
-            </w:pPr>
-            <w:r>
-              <w:t xml:space="preserve">168</w:t>
-            </w:r>
-          </w:p>
-        </w:tc>
-      </w:tr>
-      <w:tr>
-        <w:tc>
-          <w:tcPr/>
-          <w:p>
-            <w:pPr>
-              <w:pStyle w:val="Compact"/>
-            </w:pPr>
-            <w:r>
-              <w:rPr>
-                <w:rFonts w:hint="eastAsia"/>
-              </w:rPr>
-              <w:t xml:space="preserve">北京</w:t>
-            </w:r>
-          </w:p>
-        </w:tc>
-        <w:tc>
-          <w:tcPr/>
-          <w:p>
-            <w:pPr>
-              <w:pStyle w:val="Compact"/>
-              <w:jc w:val="right"/>
-            </w:pPr>
-            <w:r>
-              <w:t xml:space="preserve">168</w:t>
-            </w:r>
-          </w:p>
-        </w:tc>
-      </w:tr>
-      <w:tr>
-        <w:tc>
-          <w:tcPr/>
-          <w:p>
-            <w:pPr>
-              <w:pStyle w:val="Compact"/>
-            </w:pPr>
-            <w:r>
-              <w:rPr>
-                <w:rFonts w:hint="eastAsia"/>
-              </w:rPr>
-              <w:t xml:space="preserve">唐山</w:t>
-            </w:r>
-          </w:p>
-        </w:tc>
-        <w:tc>
-          <w:tcPr/>
-          <w:p>
-            <w:pPr>
-              <w:pStyle w:val="Compact"/>
-              <w:jc w:val="right"/>
-            </w:pPr>
-            <w:r>
-              <w:t xml:space="preserve">168</w:t>
-            </w:r>
-          </w:p>
-        </w:tc>
-      </w:tr>
-    </w:tbl>
-    <w:bookmarkEnd w:id="15"/>
-    <w:bookmarkStart w:id="16" w:name="spark-分析"/>
-    <w:p>
-      <w:pPr>
-        <w:pStyle w:val="Heading3"/>
-      </w:pPr>
-      <w:r>
-        <w:t xml:space="preserve">4.3 Spark </w:t>
-      </w:r>
-      <w:r>
-        <w:rPr>
-          <w:rFonts w:hint="eastAsia"/>
-        </w:rPr>
-        <w:t xml:space="preserve">分析</w:t>
-      </w:r>
-    </w:p>
-    <w:p>
-      <w:pPr>
-        <w:pStyle w:val="FirstParagraph"/>
-      </w:pPr>
-      <w:r>
-        <w:t xml:space="preserve">Spark </w:t>
-      </w:r>
-      <w:r>
-        <w:rPr>
-          <w:rFonts w:hint="eastAsia"/>
-        </w:rPr>
-        <w:t xml:space="preserve">分析脚本从</w:t>
-      </w:r>
-      <w:r>
-        <w:t xml:space="preserve"> </w:t>
-      </w:r>
-      <w:r>
-        <w:rPr>
-          <w:rStyle w:val="VerbatimChar"/>
-        </w:rPr>
-        <w:t xml:space="preserve">/weathertextdb</w:t>
-      </w:r>
-      <w:r>
-        <w:t xml:space="preserve"> </w:t>
-      </w:r>
-      <w:r>
-        <w:rPr>
-          <w:rFonts w:hint="eastAsia"/>
-        </w:rPr>
-        <w:t xml:space="preserve">读取历史</w:t>
-      </w:r>
-      <w:r>
-        <w:t xml:space="preserve"> </w:t>
-      </w:r>
-      <w:r>
-        <w:rPr>
-          <w:rFonts w:hint="eastAsia"/>
-        </w:rPr>
-        <w:t xml:space="preserve">CSV，输出两类设计文档要求的数据：</w:t>
+        <w:t xml:space="preserve">采集服务的写入目标如下：</w:t>
       </w:r>
     </w:p>
     <w:tbl>
@@ -2846,21 +2959,21 @@
               <w:rPr>
                 <w:rFonts w:hint="eastAsia"/>
               </w:rPr>
-              <w:t xml:space="preserve">输出路径</w:t>
-            </w:r>
-          </w:p>
-        </w:tc>
-        <w:tc>
-          <w:tcPr/>
-          <w:p>
-            <w:pPr>
-              <w:pStyle w:val="Compact"/>
-            </w:pPr>
-            <w:r>
-              <w:rPr>
-                <w:rFonts w:hint="eastAsia"/>
-              </w:rPr>
-              <w:t xml:space="preserve">含义</w:t>
+              <w:t xml:space="preserve">目标</w:t>
+            </w:r>
+          </w:p>
+        </w:tc>
+        <w:tc>
+          <w:tcPr/>
+          <w:p>
+            <w:pPr>
+              <w:pStyle w:val="Compact"/>
+            </w:pPr>
+            <w:r>
+              <w:rPr>
+                <w:rFonts w:hint="eastAsia"/>
+              </w:rPr>
+              <w:t xml:space="preserve">写入方式</w:t>
             </w:r>
           </w:p>
         </w:tc>
@@ -2874,23 +2987,50 @@
             </w:pPr>
             <w:r>
               <w:rPr>
+                <w:rFonts w:hint="eastAsia"/>
+              </w:rPr>
+              <w:t xml:space="preserve">本地实时</w:t>
+            </w:r>
+            <w:r>
+              <w:t xml:space="preserve"> CSV</w:t>
+            </w:r>
+          </w:p>
+        </w:tc>
+        <w:tc>
+          <w:tcPr/>
+          <w:p>
+            <w:pPr>
+              <w:pStyle w:val="Compact"/>
+            </w:pPr>
+            <w:r>
+              <w:rPr>
+                <w:rFonts w:hint="eastAsia"/>
+              </w:rPr>
+              <w:t xml:space="preserve">追加到</w:t>
+            </w:r>
+            <w:r>
+              <w:t xml:space="preserve"> </w:t>
+            </w:r>
+            <w:r>
+              <w:rPr>
                 <w:rStyle w:val="VerbatimChar"/>
               </w:rPr>
-              <w:t xml:space="preserve">/weather_analysis/window_mean</w:t>
-            </w:r>
-          </w:p>
-        </w:tc>
-        <w:tc>
-          <w:tcPr/>
-          <w:p>
-            <w:pPr>
-              <w:pStyle w:val="Compact"/>
-            </w:pPr>
-            <w:r>
-              <w:rPr>
-                <w:rFonts w:hint="eastAsia"/>
-              </w:rPr>
-              <w:t xml:space="preserve">小时序列，可作为窗口均值结果用于趋势图</w:t>
+              <w:t xml:space="preserve">data/raw/live_weather_observations.csv</w:t>
+            </w:r>
+            <w:r>
+              <w:rPr>
+                <w:rFonts w:hint="eastAsia"/>
+              </w:rPr>
+              <w:t xml:space="preserve">，保留</w:t>
+            </w:r>
+            <w:r>
+              <w:t xml:space="preserve"> ESP32 </w:t>
+            </w:r>
+            <w:r>
+              <w:rPr>
+                <w:rFonts w:hint="eastAsia"/>
+              </w:rPr>
+              <w:t xml:space="preserve">样本号</w:t>
             </w:r>
           </w:p>
         </w:tc>
@@ -2903,29 +3043,880 @@
               <w:pStyle w:val="Compact"/>
             </w:pPr>
             <w:r>
+              <w:t xml:space="preserve">HDFS</w:t>
+            </w:r>
+          </w:p>
+        </w:tc>
+        <w:tc>
+          <w:tcPr/>
+          <w:p>
+            <w:pPr>
+              <w:pStyle w:val="Compact"/>
+            </w:pPr>
+            <w:r>
+              <w:rPr>
+                <w:rFonts w:hint="eastAsia"/>
+              </w:rPr>
+              <w:t xml:space="preserve">批量写入课程兼容</w:t>
+            </w:r>
+            <w:r>
+              <w:t xml:space="preserve"> 7 </w:t>
+            </w:r>
+            <w:r>
+              <w:rPr>
+                <w:rFonts w:hint="eastAsia"/>
+              </w:rPr>
+              <w:t xml:space="preserve">列</w:t>
+            </w:r>
+            <w:r>
+              <w:t xml:space="preserve"> </w:t>
+            </w:r>
+            <w:r>
               <w:rPr>
                 <w:rStyle w:val="VerbatimChar"/>
               </w:rPr>
-              <w:t xml:space="preserve">/weather_analysis/summary</w:t>
-            </w:r>
-          </w:p>
-        </w:tc>
-        <w:tc>
-          <w:tcPr/>
-          <w:p>
-            <w:pPr>
-              <w:pStyle w:val="Compact"/>
-            </w:pPr>
-            <w:r>
-              <w:rPr>
-                <w:rFonts w:hint="eastAsia"/>
-              </w:rPr>
-              <w:t xml:space="preserve">站点统计摘要</w:t>
+              <w:t xml:space="preserve">/weathertextdb/live_*.csv</w:t>
+            </w:r>
+          </w:p>
+        </w:tc>
+      </w:tr>
+      <w:tr>
+        <w:tc>
+          <w:tcPr/>
+          <w:p>
+            <w:pPr>
+              <w:pStyle w:val="Compact"/>
+            </w:pPr>
+            <w:r>
+              <w:t xml:space="preserve">HBase</w:t>
+            </w:r>
+          </w:p>
+        </w:tc>
+        <w:tc>
+          <w:tcPr/>
+          <w:p>
+            <w:pPr>
+              <w:pStyle w:val="Compact"/>
+            </w:pPr>
+            <w:r>
+              <w:rPr>
+                <w:rFonts w:hint="eastAsia"/>
+              </w:rPr>
+              <w:t xml:space="preserve">写入</w:t>
+            </w:r>
+            <w:r>
+              <w:t xml:space="preserve"> </w:t>
+            </w:r>
+            <w:r>
+              <w:rPr>
+                <w:rStyle w:val="VerbatimChar"/>
+              </w:rPr>
+              <w:t xml:space="preserve">realtime_weather</w:t>
+            </w:r>
+            <w:r>
+              <w:rPr>
+                <w:rFonts w:hint="eastAsia"/>
+              </w:rPr>
+              <w:t xml:space="preserve">，列族</w:t>
+            </w:r>
+            <w:r>
+              <w:t xml:space="preserve"> </w:t>
+            </w:r>
+            <w:r>
+              <w:rPr>
+                <w:rStyle w:val="VerbatimChar"/>
+              </w:rPr>
+              <w:t xml:space="preserve">data</w:t>
+            </w:r>
+            <w:r>
+              <w:rPr>
+                <w:rFonts w:hint="eastAsia"/>
+              </w:rPr>
+              <w:t xml:space="preserve">，TTL</w:t>
+            </w:r>
+            <w:r>
+              <w:t xml:space="preserve"> 150 </w:t>
+            </w:r>
+            <w:r>
+              <w:rPr>
+                <w:rFonts w:hint="eastAsia"/>
+              </w:rPr>
+              <w:t xml:space="preserve">秒</w:t>
             </w:r>
           </w:p>
         </w:tc>
       </w:tr>
     </w:tbl>
+    <w:bookmarkEnd w:id="15"/>
+    <w:bookmarkStart w:id="16" w:name="hdfs-与-hive"/>
+    <w:p>
+      <w:pPr>
+        <w:pStyle w:val="Heading3"/>
+      </w:pPr>
+      <w:r>
+        <w:t xml:space="preserve">4.3 HDFS </w:t>
+      </w:r>
+      <w:r>
+        <w:rPr>
+          <w:rFonts w:hint="eastAsia"/>
+        </w:rPr>
+        <w:t xml:space="preserve">与</w:t>
+      </w:r>
+      <w:r>
+        <w:t xml:space="preserve"> Hive</w:t>
+      </w:r>
+    </w:p>
+    <w:p>
+      <w:pPr>
+        <w:pStyle w:val="FirstParagraph"/>
+      </w:pPr>
+      <w:r>
+        <w:rPr>
+          <w:rFonts w:hint="eastAsia"/>
+        </w:rPr>
+        <w:t xml:space="preserve">历史</w:t>
+      </w:r>
+      <w:r>
+        <w:t xml:space="preserve"> CSV </w:t>
+      </w:r>
+      <w:r>
+        <w:rPr>
+          <w:rFonts w:hint="eastAsia"/>
+        </w:rPr>
+        <w:t xml:space="preserve">上传到设计文档要求的</w:t>
+      </w:r>
+      <w:r>
+        <w:t xml:space="preserve"> HDFS </w:t>
+      </w:r>
+      <w:r>
+        <w:rPr>
+          <w:rFonts w:hint="eastAsia"/>
+        </w:rPr>
+        <w:t xml:space="preserve">路径：</w:t>
+      </w:r>
+    </w:p>
+    <w:p>
+      <w:pPr>
+        <w:pStyle w:val="SourceCode"/>
+      </w:pPr>
+      <w:r>
+        <w:rPr>
+          <w:rStyle w:val="ExtensionTok"/>
+        </w:rPr>
+        <w:t xml:space="preserve">./scripts/upload-weather-to-hdfs.sh</w:t>
+      </w:r>
+      <w:r>
+        <w:rPr>
+          <w:rStyle w:val="NormalTok"/>
+        </w:rPr>
+        <w:t xml:space="preserve"> data/raw/weather_observations.csv</w:t>
+      </w:r>
+    </w:p>
+    <w:p>
+      <w:pPr>
+        <w:pStyle w:val="FirstParagraph"/>
+      </w:pPr>
+      <w:r>
+        <w:rPr>
+          <w:rFonts w:hint="eastAsia"/>
+        </w:rPr>
+        <w:t xml:space="preserve">上传后</w:t>
+      </w:r>
+      <w:r>
+        <w:t xml:space="preserve"> </w:t>
+      </w:r>
+      <w:r>
+        <w:rPr>
+          <w:rStyle w:val="VerbatimChar"/>
+        </w:rPr>
+        <w:t xml:space="preserve">/weathertextdb</w:t>
+      </w:r>
+      <w:r>
+        <w:t xml:space="preserve"> </w:t>
+      </w:r>
+      <w:r>
+        <w:rPr>
+          <w:rFonts w:hint="eastAsia"/>
+        </w:rPr>
+        <w:t xml:space="preserve">中只保留本项目文件：</w:t>
+      </w:r>
+    </w:p>
+    <w:p>
+      <w:pPr>
+        <w:pStyle w:val="SourceCode"/>
+      </w:pPr>
+      <w:r>
+        <w:rPr>
+          <w:rStyle w:val="VerbatimChar"/>
+        </w:rPr>
+        <w:t xml:space="preserve">/weathertextdb/weather_observations.csv</w:t>
+      </w:r>
+    </w:p>
+    <w:p>
+      <w:pPr>
+        <w:pStyle w:val="FirstParagraph"/>
+      </w:pPr>
+      <w:r>
+        <w:t xml:space="preserve">Hive </w:t>
+      </w:r>
+      <w:r>
+        <w:rPr>
+          <w:rFonts w:hint="eastAsia"/>
+        </w:rPr>
+        <w:t xml:space="preserve">外部表直接引用</w:t>
+      </w:r>
+      <w:r>
+        <w:t xml:space="preserve"> </w:t>
+      </w:r>
+      <w:r>
+        <w:rPr>
+          <w:rStyle w:val="VerbatimChar"/>
+        </w:rPr>
+        <w:t xml:space="preserve">/weathertextdb</w:t>
+      </w:r>
+      <w:r>
+        <w:rPr>
+          <w:rFonts w:hint="eastAsia"/>
+        </w:rPr>
+        <w:t xml:space="preserve">：</w:t>
+      </w:r>
+    </w:p>
+    <w:p>
+      <w:pPr>
+        <w:pStyle w:val="SourceCode"/>
+      </w:pPr>
+      <w:r>
+        <w:rPr>
+          <w:rStyle w:val="KeywordTok"/>
+        </w:rPr>
+        <w:t xml:space="preserve">CREATE</w:t>
+      </w:r>
+      <w:r>
+        <w:rPr>
+          <w:rStyle w:val="NormalTok"/>
+        </w:rPr>
+        <w:t xml:space="preserve"> EXTERNAL </w:t>
+      </w:r>
+      <w:r>
+        <w:rPr>
+          <w:rStyle w:val="KeywordTok"/>
+        </w:rPr>
+        <w:t xml:space="preserve">TABLE</w:t>
+      </w:r>
+      <w:r>
+        <w:rPr>
+          <w:rStyle w:val="NormalTok"/>
+        </w:rPr>
+        <w:t xml:space="preserve"> weather_table (</w:t>
+      </w:r>
+      <w:r>
+        <w:br/>
+      </w:r>
+      <w:r>
+        <w:rPr>
+          <w:rStyle w:val="NormalTok"/>
+        </w:rPr>
+        <w:t xml:space="preserve">  collect_time STRING,</w:t>
+      </w:r>
+      <w:r>
+        <w:br/>
+      </w:r>
+      <w:r>
+        <w:rPr>
+          <w:rStyle w:val="NormalTok"/>
+        </w:rPr>
+        <w:t xml:space="preserve">  station_id STRING,</w:t>
+      </w:r>
+      <w:r>
+        <w:br/>
+      </w:r>
+      <w:r>
+        <w:rPr>
+          <w:rStyle w:val="NormalTok"/>
+        </w:rPr>
+        <w:t xml:space="preserve">  station_name STRING,</w:t>
+      </w:r>
+      <w:r>
+        <w:br/>
+      </w:r>
+      <w:r>
+        <w:rPr>
+          <w:rStyle w:val="NormalTok"/>
+        </w:rPr>
+        <w:t xml:space="preserve">  temperature </w:t>
+      </w:r>
+      <w:r>
+        <w:rPr>
+          <w:rStyle w:val="DataTypeTok"/>
+        </w:rPr>
+        <w:t xml:space="preserve">DOUBLE</w:t>
+      </w:r>
+      <w:r>
+        <w:rPr>
+          <w:rStyle w:val="NormalTok"/>
+        </w:rPr>
+        <w:t xml:space="preserve">,</w:t>
+      </w:r>
+      <w:r>
+        <w:br/>
+      </w:r>
+      <w:r>
+        <w:rPr>
+          <w:rStyle w:val="NormalTok"/>
+        </w:rPr>
+        <w:t xml:space="preserve">  humidity </w:t>
+      </w:r>
+      <w:r>
+        <w:rPr>
+          <w:rStyle w:val="DataTypeTok"/>
+        </w:rPr>
+        <w:t xml:space="preserve">DOUBLE</w:t>
+      </w:r>
+      <w:r>
+        <w:rPr>
+          <w:rStyle w:val="NormalTok"/>
+        </w:rPr>
+        <w:t xml:space="preserve">,</w:t>
+      </w:r>
+      <w:r>
+        <w:br/>
+      </w:r>
+      <w:r>
+        <w:rPr>
+          <w:rStyle w:val="NormalTok"/>
+        </w:rPr>
+        <w:t xml:space="preserve">  pressure </w:t>
+      </w:r>
+      <w:r>
+        <w:rPr>
+          <w:rStyle w:val="DataTypeTok"/>
+        </w:rPr>
+        <w:t xml:space="preserve">DOUBLE</w:t>
+      </w:r>
+      <w:r>
+        <w:rPr>
+          <w:rStyle w:val="NormalTok"/>
+        </w:rPr>
+        <w:t xml:space="preserve">,</w:t>
+      </w:r>
+      <w:r>
+        <w:br/>
+      </w:r>
+      <w:r>
+        <w:rPr>
+          <w:rStyle w:val="NormalTok"/>
+        </w:rPr>
+        <w:t xml:space="preserve">  wind_speed </w:t>
+      </w:r>
+      <w:r>
+        <w:rPr>
+          <w:rStyle w:val="DataTypeTok"/>
+        </w:rPr>
+        <w:t xml:space="preserve">DOUBLE</w:t>
+      </w:r>
+      <w:r>
+        <w:rPr>
+          <w:rStyle w:val="NormalTok"/>
+        </w:rPr>
+        <w:t xml:space="preserve">,</w:t>
+      </w:r>
+      <w:r>
+        <w:br/>
+      </w:r>
+      <w:r>
+        <w:rPr>
+          <w:rStyle w:val="NormalTok"/>
+        </w:rPr>
+        <w:t xml:space="preserve">  wind_direction </w:t>
+      </w:r>
+      <w:r>
+        <w:rPr>
+          <w:rStyle w:val="DataTypeTok"/>
+        </w:rPr>
+        <w:t xml:space="preserve">DOUBLE</w:t>
+      </w:r>
+      <w:r>
+        <w:rPr>
+          <w:rStyle w:val="NormalTok"/>
+        </w:rPr>
+        <w:t xml:space="preserve">,</w:t>
+      </w:r>
+      <w:r>
+        <w:br/>
+      </w:r>
+      <w:r>
+        <w:rPr>
+          <w:rStyle w:val="NormalTok"/>
+        </w:rPr>
+        <w:t xml:space="preserve">  weather_code </w:t>
+      </w:r>
+      <w:r>
+        <w:rPr>
+          <w:rStyle w:val="DataTypeTok"/>
+        </w:rPr>
+        <w:t xml:space="preserve">INT</w:t>
+      </w:r>
+      <w:r>
+        <w:br/>
+      </w:r>
+      <w:r>
+        <w:rPr>
+          <w:rStyle w:val="NormalTok"/>
+        </w:rPr>
+        <w:t xml:space="preserve">)</w:t>
+      </w:r>
+      <w:r>
+        <w:br/>
+      </w:r>
+      <w:r>
+        <w:rPr>
+          <w:rStyle w:val="KeywordTok"/>
+        </w:rPr>
+        <w:t xml:space="preserve">ROW</w:t>
+      </w:r>
+      <w:r>
+        <w:rPr>
+          <w:rStyle w:val="NormalTok"/>
+        </w:rPr>
+        <w:t xml:space="preserve"> FORMAT DELIMITED</w:t>
+      </w:r>
+      <w:r>
+        <w:br/>
+      </w:r>
+      <w:r>
+        <w:rPr>
+          <w:rStyle w:val="NormalTok"/>
+        </w:rPr>
+        <w:t xml:space="preserve">FIELDS TERMINATED </w:t>
+      </w:r>
+      <w:r>
+        <w:rPr>
+          <w:rStyle w:val="KeywordTok"/>
+        </w:rPr>
+        <w:t xml:space="preserve">BY</w:t>
+      </w:r>
+      <w:r>
+        <w:rPr>
+          <w:rStyle w:val="NormalTok"/>
+        </w:rPr>
+        <w:t xml:space="preserve"> </w:t>
+      </w:r>
+      <w:r>
+        <w:rPr>
+          <w:rStyle w:val="StringTok"/>
+        </w:rPr>
+        <w:t xml:space="preserve">','</w:t>
+      </w:r>
+      <w:r>
+        <w:br/>
+      </w:r>
+      <w:r>
+        <w:rPr>
+          <w:rStyle w:val="NormalTok"/>
+        </w:rPr>
+        <w:t xml:space="preserve">LOCATION </w:t>
+      </w:r>
+      <w:r>
+        <w:rPr>
+          <w:rStyle w:val="StringTok"/>
+        </w:rPr>
+        <w:t xml:space="preserve">'/weathertextdb'</w:t>
+      </w:r>
+      <w:r>
+        <w:rPr>
+          <w:rStyle w:val="NormalTok"/>
+        </w:rPr>
+        <w:t xml:space="preserve">;</w:t>
+      </w:r>
+    </w:p>
+    <w:p>
+      <w:pPr>
+        <w:pStyle w:val="FirstParagraph"/>
+      </w:pPr>
+      <w:r>
+        <w:rPr>
+          <w:rFonts w:hint="eastAsia"/>
+        </w:rPr>
+        <w:t xml:space="preserve">验收查询结果显示三个站点记录数一致：</w:t>
+      </w:r>
+    </w:p>
+    <w:tbl>
+      <w:tblPr>
+        <w:tblStyle w:val="Table"/>
+        <w:tblW w:type="auto" w:w="0"/>
+        <w:tblLook w:firstRow="1" w:lastRow="0" w:firstColumn="0" w:lastColumn="0" w:noHBand="0" w:noVBand="0" w:val="0020"/>
+      </w:tblPr>
+      <w:tblGrid>
+        <w:gridCol w:w="3960"/>
+        <w:gridCol w:w="3960"/>
+      </w:tblGrid>
+      <w:tr>
+        <w:trPr>
+          <w:tblHeader w:val="on"/>
+        </w:trPr>
+        <w:tc>
+          <w:tcPr/>
+          <w:p>
+            <w:pPr>
+              <w:pStyle w:val="Compact"/>
+            </w:pPr>
+            <w:r>
+              <w:rPr>
+                <w:rFonts w:hint="eastAsia"/>
+              </w:rPr>
+              <w:t xml:space="preserve">站点</w:t>
+            </w:r>
+          </w:p>
+        </w:tc>
+        <w:tc>
+          <w:tcPr/>
+          <w:p>
+            <w:pPr>
+              <w:pStyle w:val="Compact"/>
+              <w:jc w:val="right"/>
+            </w:pPr>
+            <w:r>
+              <w:rPr>
+                <w:rFonts w:hint="eastAsia"/>
+              </w:rPr>
+              <w:t xml:space="preserve">记录数</w:t>
+            </w:r>
+          </w:p>
+        </w:tc>
+      </w:tr>
+      <w:tr>
+        <w:tc>
+          <w:tcPr/>
+          <w:p>
+            <w:pPr>
+              <w:pStyle w:val="Compact"/>
+            </w:pPr>
+            <w:r>
+              <w:rPr>
+                <w:rFonts w:hint="eastAsia"/>
+              </w:rPr>
+              <w:t xml:space="preserve">上海</w:t>
+            </w:r>
+          </w:p>
+        </w:tc>
+        <w:tc>
+          <w:tcPr/>
+          <w:p>
+            <w:pPr>
+              <w:pStyle w:val="Compact"/>
+              <w:jc w:val="right"/>
+            </w:pPr>
+            <w:r>
+              <w:t xml:space="preserve">168</w:t>
+            </w:r>
+          </w:p>
+        </w:tc>
+      </w:tr>
+      <w:tr>
+        <w:tc>
+          <w:tcPr/>
+          <w:p>
+            <w:pPr>
+              <w:pStyle w:val="Compact"/>
+            </w:pPr>
+            <w:r>
+              <w:rPr>
+                <w:rFonts w:hint="eastAsia"/>
+              </w:rPr>
+              <w:t xml:space="preserve">北京</w:t>
+            </w:r>
+          </w:p>
+        </w:tc>
+        <w:tc>
+          <w:tcPr/>
+          <w:p>
+            <w:pPr>
+              <w:pStyle w:val="Compact"/>
+              <w:jc w:val="right"/>
+            </w:pPr>
+            <w:r>
+              <w:t xml:space="preserve">168</w:t>
+            </w:r>
+          </w:p>
+        </w:tc>
+      </w:tr>
+      <w:tr>
+        <w:tc>
+          <w:tcPr/>
+          <w:p>
+            <w:pPr>
+              <w:pStyle w:val="Compact"/>
+            </w:pPr>
+            <w:r>
+              <w:rPr>
+                <w:rFonts w:hint="eastAsia"/>
+              </w:rPr>
+              <w:t xml:space="preserve">唐山</w:t>
+            </w:r>
+          </w:p>
+        </w:tc>
+        <w:tc>
+          <w:tcPr/>
+          <w:p>
+            <w:pPr>
+              <w:pStyle w:val="Compact"/>
+              <w:jc w:val="right"/>
+            </w:pPr>
+            <w:r>
+              <w:t xml:space="preserve">168</w:t>
+            </w:r>
+          </w:p>
+        </w:tc>
+      </w:tr>
+    </w:tbl>
+    <w:bookmarkEnd w:id="16"/>
+    <w:bookmarkStart w:id="17" w:name="spark-分析"/>
+    <w:p>
+      <w:pPr>
+        <w:pStyle w:val="Heading3"/>
+      </w:pPr>
+      <w:r>
+        <w:t xml:space="preserve">4.4 Spark </w:t>
+      </w:r>
+      <w:r>
+        <w:rPr>
+          <w:rFonts w:hint="eastAsia"/>
+        </w:rPr>
+        <w:t xml:space="preserve">分析</w:t>
+      </w:r>
+    </w:p>
+    <w:p>
+      <w:pPr>
+        <w:pStyle w:val="FirstParagraph"/>
+      </w:pPr>
+      <w:r>
+        <w:t xml:space="preserve">Spark </w:t>
+      </w:r>
+      <w:r>
+        <w:rPr>
+          <w:rFonts w:hint="eastAsia"/>
+        </w:rPr>
+        <w:t xml:space="preserve">分析脚本支持两种输入：本地验证时直接读取</w:t>
+      </w:r>
+      <w:r>
+        <w:t xml:space="preserve"> </w:t>
+      </w:r>
+      <w:r>
+        <w:rPr>
+          <w:rStyle w:val="VerbatimChar"/>
+        </w:rPr>
+        <w:t xml:space="preserve">/weathertextdb</w:t>
+      </w:r>
+      <w:r>
+        <w:t xml:space="preserve"> </w:t>
+      </w:r>
+      <w:r>
+        <w:rPr>
+          <w:rFonts w:hint="eastAsia"/>
+        </w:rPr>
+        <w:t xml:space="preserve">中的</w:t>
+      </w:r>
+      <w:r>
+        <w:t xml:space="preserve"> </w:t>
+      </w:r>
+      <w:r>
+        <w:rPr>
+          <w:rFonts w:hint="eastAsia"/>
+        </w:rPr>
+        <w:t xml:space="preserve">CSV；课程展示时通过</w:t>
+      </w:r>
+      <w:r>
+        <w:t xml:space="preserve"> Hive </w:t>
+      </w:r>
+      <w:r>
+        <w:rPr>
+          <w:rFonts w:hint="eastAsia"/>
+        </w:rPr>
+        <w:t xml:space="preserve">表</w:t>
+      </w:r>
+      <w:r>
+        <w:t xml:space="preserve"> </w:t>
+      </w:r>
+      <w:r>
+        <w:rPr>
+          <w:rStyle w:val="VerbatimChar"/>
+        </w:rPr>
+        <w:t xml:space="preserve">weather_table</w:t>
+      </w:r>
+      <w:r>
+        <w:t xml:space="preserve"> </w:t>
+      </w:r>
+      <w:r>
+        <w:rPr>
+          <w:rFonts w:hint="eastAsia"/>
+        </w:rPr>
+        <w:t xml:space="preserve">读取</w:t>
+      </w:r>
+      <w:r>
+        <w:t xml:space="preserve"> HDFS </w:t>
+      </w:r>
+      <w:r>
+        <w:rPr>
+          <w:rFonts w:hint="eastAsia"/>
+        </w:rPr>
+        <w:t xml:space="preserve">原始数据，并在</w:t>
+      </w:r>
+      <w:r>
+        <w:t xml:space="preserve"> YARN </w:t>
+      </w:r>
+      <w:r>
+        <w:rPr>
+          <w:rFonts w:hint="eastAsia"/>
+        </w:rPr>
+        <w:t xml:space="preserve">上运行。脚本按</w:t>
+      </w:r>
+      <w:r>
+        <w:t xml:space="preserve"> 10 </w:t>
+      </w:r>
+      <w:r>
+        <w:rPr>
+          <w:rFonts w:hint="eastAsia"/>
+        </w:rPr>
+        <w:t xml:space="preserve">秒窗口计算均值，同时输出设计文档路径和课程兼容路径：</w:t>
+      </w:r>
+    </w:p>
+    <w:tbl>
+      <w:tblPr>
+        <w:tblStyle w:val="Table"/>
+        <w:tblW w:type="auto" w:w="0"/>
+        <w:tblLook w:firstRow="1" w:lastRow="0" w:firstColumn="0" w:lastColumn="0" w:noHBand="0" w:noVBand="0" w:val="0020"/>
+      </w:tblPr>
+      <w:tblGrid>
+        <w:gridCol w:w="3960"/>
+        <w:gridCol w:w="3960"/>
+      </w:tblGrid>
+      <w:tr>
+        <w:trPr>
+          <w:tblHeader w:val="on"/>
+        </w:trPr>
+        <w:tc>
+          <w:tcPr/>
+          <w:p>
+            <w:pPr>
+              <w:pStyle w:val="Compact"/>
+            </w:pPr>
+            <w:r>
+              <w:rPr>
+                <w:rFonts w:hint="eastAsia"/>
+              </w:rPr>
+              <w:t xml:space="preserve">输出路径</w:t>
+            </w:r>
+          </w:p>
+        </w:tc>
+        <w:tc>
+          <w:tcPr/>
+          <w:p>
+            <w:pPr>
+              <w:pStyle w:val="Compact"/>
+            </w:pPr>
+            <w:r>
+              <w:rPr>
+                <w:rFonts w:hint="eastAsia"/>
+              </w:rPr>
+              <w:t xml:space="preserve">含义</w:t>
+            </w:r>
+          </w:p>
+        </w:tc>
+      </w:tr>
+      <w:tr>
+        <w:tc>
+          <w:tcPr/>
+          <w:p>
+            <w:pPr>
+              <w:pStyle w:val="Compact"/>
+            </w:pPr>
+            <w:r>
+              <w:rPr>
+                <w:rStyle w:val="VerbatimChar"/>
+              </w:rPr>
+              <w:t xml:space="preserve">/weather_analysis/window_mean</w:t>
+            </w:r>
+          </w:p>
+        </w:tc>
+        <w:tc>
+          <w:tcPr/>
+          <w:p>
+            <w:pPr>
+              <w:pStyle w:val="Compact"/>
+            </w:pPr>
+            <w:r>
+              <w:t xml:space="preserve">10 </w:t>
+            </w:r>
+            <w:r>
+              <w:rPr>
+                <w:rFonts w:hint="eastAsia"/>
+              </w:rPr>
+              <w:t xml:space="preserve">秒窗口均值序列</w:t>
+            </w:r>
+          </w:p>
+        </w:tc>
+      </w:tr>
+      <w:tr>
+        <w:tc>
+          <w:tcPr/>
+          <w:p>
+            <w:pPr>
+              <w:pStyle w:val="Compact"/>
+            </w:pPr>
+            <w:r>
+              <w:rPr>
+                <w:rStyle w:val="VerbatimChar"/>
+              </w:rPr>
+              <w:t xml:space="preserve">/weather_analysis/summary</w:t>
+            </w:r>
+          </w:p>
+        </w:tc>
+        <w:tc>
+          <w:tcPr/>
+          <w:p>
+            <w:pPr>
+              <w:pStyle w:val="Compact"/>
+            </w:pPr>
+            <w:r>
+              <w:rPr>
+                <w:rFonts w:hint="eastAsia"/>
+              </w:rPr>
+              <w:t xml:space="preserve">站点统计摘要</w:t>
+            </w:r>
+          </w:p>
+        </w:tc>
+      </w:tr>
+      <w:tr>
+        <w:tc>
+          <w:tcPr/>
+          <w:p>
+            <w:pPr>
+              <w:pStyle w:val="Compact"/>
+            </w:pPr>
+            <w:r>
+              <w:rPr>
+                <w:rStyle w:val="VerbatimChar"/>
+              </w:rPr>
+              <w:t xml:space="preserve">/weather_10secmean</w:t>
+            </w:r>
+          </w:p>
+        </w:tc>
+        <w:tc>
+          <w:tcPr/>
+          <w:p>
+            <w:pPr>
+              <w:pStyle w:val="Compact"/>
+            </w:pPr>
+            <w:r>
+              <w:rPr>
+                <w:rFonts w:hint="eastAsia"/>
+              </w:rPr>
+              <w:t xml:space="preserve">课程指导文档兼容路径</w:t>
+            </w:r>
+          </w:p>
+        </w:tc>
+      </w:tr>
+    </w:tbl>
     <w:p>
       <w:pPr>
         <w:pStyle w:val="BodyText"/>
@@ -2945,103 +3936,16 @@
         <w:rPr>
           <w:rStyle w:val="ExtensionTok"/>
         </w:rPr>
-        <w:t xml:space="preserve">./scripts/distro-bigdata.sh</w:t>
-      </w:r>
-      <w:r>
-        <w:rPr>
-          <w:rStyle w:val="NormalTok"/>
-        </w:rPr>
-        <w:t xml:space="preserve"> </w:t>
-      </w:r>
-      <w:r>
-        <w:rPr>
-          <w:rStyle w:val="StringTok"/>
-        </w:rPr>
-        <w:t xml:space="preserve">"spark-submit --master local[2] </w:t>
-      </w:r>
-      <w:r>
-        <w:rPr>
-          <w:rStyle w:val="DataTypeTok"/>
-        </w:rPr>
-        <w:t xml:space="preserve">\</w:t>
+        <w:t xml:space="preserve">./scripts/create-hive-weather-table.sh</w:t>
       </w:r>
       <w:r>
         <w:br/>
       </w:r>
       <w:r>
         <w:rPr>
-          <w:rStyle w:val="StringTok"/>
-        </w:rPr>
-        <w:t xml:space="preserve">  </w:t>
-      </w:r>
-      <w:r>
-        <w:rPr>
-          <w:rStyle w:val="VariableTok"/>
-        </w:rPr>
-        <w:t xml:space="preserve">$PROJECT_ROOT</w:t>
-      </w:r>
-      <w:r>
-        <w:rPr>
-          <w:rStyle w:val="StringTok"/>
-        </w:rPr>
-        <w:t xml:space="preserve">/backend/scripts/spark_weather_analysis.py </w:t>
-      </w:r>
-      <w:r>
-        <w:rPr>
-          <w:rStyle w:val="DataTypeTok"/>
-        </w:rPr>
-        <w:t xml:space="preserve">\</w:t>
-      </w:r>
-      <w:r>
-        <w:br/>
-      </w:r>
-      <w:r>
-        <w:rPr>
-          <w:rStyle w:val="StringTok"/>
-        </w:rPr>
-        <w:t xml:space="preserve">  /weathertextdb </w:t>
-      </w:r>
-      <w:r>
-        <w:rPr>
-          <w:rStyle w:val="DataTypeTok"/>
-        </w:rPr>
-        <w:t xml:space="preserve">\</w:t>
-      </w:r>
-      <w:r>
-        <w:br/>
-      </w:r>
-      <w:r>
-        <w:rPr>
-          <w:rStyle w:val="StringTok"/>
-        </w:rPr>
-        <w:t xml:space="preserve">  /weather_analysis </w:t>
-      </w:r>
-      <w:r>
-        <w:rPr>
-          <w:rStyle w:val="DataTypeTok"/>
-        </w:rPr>
-        <w:t xml:space="preserve">\</w:t>
-      </w:r>
-      <w:r>
-        <w:br/>
-      </w:r>
-      <w:r>
-        <w:rPr>
-          <w:rStyle w:val="StringTok"/>
-        </w:rPr>
-        <w:t xml:space="preserve">  </w:t>
-      </w:r>
-      <w:r>
-        <w:rPr>
-          <w:rStyle w:val="VariableTok"/>
-        </w:rPr>
-        <w:t xml:space="preserve">$PROJECT_ROOT</w:t>
-      </w:r>
-      <w:r>
-        <w:rPr>
-          <w:rStyle w:val="StringTok"/>
-        </w:rPr>
-        <w:t xml:space="preserve">/data/processed"</w:t>
+          <w:rStyle w:val="ExtensionTok"/>
+        </w:rPr>
+        <w:t xml:space="preserve">./scripts/run-spark-analysis-yarn.sh</w:t>
       </w:r>
     </w:p>
     <w:p>
@@ -3545,14 +4449,14 @@
         </w:tc>
       </w:tr>
     </w:tbl>
-    <w:bookmarkEnd w:id="16"/>
-    <w:bookmarkStart w:id="17" w:name="hbase-当前表"/>
+    <w:bookmarkEnd w:id="17"/>
+    <w:bookmarkStart w:id="18" w:name="hbase-当前表"/>
     <w:p>
       <w:pPr>
         <w:pStyle w:val="Heading3"/>
       </w:pPr>
       <w:r>
-        <w:t xml:space="preserve">4.4 HBase </w:t>
+        <w:t xml:space="preserve">4.5 HBase </w:t>
       </w:r>
       <w:r>
         <w:rPr>
@@ -3569,7 +4473,7 @@
         <w:rPr>
           <w:rFonts w:hint="eastAsia"/>
         </w:rPr>
-        <w:t xml:space="preserve">当前三站数据写入</w:t>
+        <w:t xml:space="preserve">当前数据写入</w:t>
       </w:r>
       <w:r>
         <w:t xml:space="preserve"> HBase </w:t>
@@ -3758,7 +4662,7 @@
         <w:rPr>
           <w:rFonts w:hint="eastAsia"/>
         </w:rPr>
-        <w:t xml:space="preserve">已返回北京、上海、唐山三行当前数据，包含</w:t>
+        <w:t xml:space="preserve">已返回实时记录，包含</w:t>
       </w:r>
       <w:r>
         <w:t xml:space="preserve"> </w:t>
@@ -3821,12 +4725,30 @@
         <w:rPr>
           <w:rFonts w:hint="eastAsia"/>
         </w:rPr>
-        <w:t xml:space="preserve">等列。</w:t>
-      </w:r>
-    </w:p>
-    <w:bookmarkEnd w:id="17"/>
+        <w:t xml:space="preserve">等列。在线采集服务和离线当前数据写入脚本均使用同一张表，并设置实时列族</w:t>
+      </w:r>
+      <w:r>
+        <w:t xml:space="preserve"> TTL </w:t>
+      </w:r>
+      <w:r>
+        <w:rPr>
+          <w:rFonts w:hint="eastAsia"/>
+        </w:rPr>
+        <w:t xml:space="preserve">为</w:t>
+      </w:r>
+      <w:r>
+        <w:t xml:space="preserve"> 150 </w:t>
+      </w:r>
+      <w:r>
+        <w:rPr>
+          <w:rFonts w:hint="eastAsia"/>
+        </w:rPr>
+        <w:t xml:space="preserve">秒。</w:t>
+      </w:r>
+    </w:p>
     <w:bookmarkEnd w:id="18"/>
-    <w:bookmarkStart w:id="19" w:name="五fastapi-接口实现"/>
+    <w:bookmarkEnd w:id="19"/>
+    <w:bookmarkStart w:id="20" w:name="五fastapi-接口实现"/>
     <w:p>
       <w:pPr>
         <w:pStyle w:val="Heading2"/>
@@ -3994,7 +4916,58 @@
         <w:rPr>
           <w:rFonts w:hint="eastAsia"/>
         </w:rPr>
-        <w:t xml:space="preserve">主要接口按设计文档对齐：</w:t>
+        <w:t xml:space="preserve">主要接口按设计文档对齐。</w:t>
+      </w:r>
+      <w:r>
+        <w:rPr>
+          <w:rStyle w:val="VerbatimChar"/>
+        </w:rPr>
+        <w:t xml:space="preserve">/api/stations/current</w:t>
+      </w:r>
+      <w:r>
+        <w:t xml:space="preserve"> </w:t>
+      </w:r>
+      <w:r>
+        <w:rPr>
+          <w:rFonts w:hint="eastAsia"/>
+        </w:rPr>
+        <w:t xml:space="preserve">会优先尝试读取</w:t>
+      </w:r>
+      <w:r>
+        <w:t xml:space="preserve"> HBase </w:t>
+      </w:r>
+      <w:r>
+        <w:rPr>
+          <w:rFonts w:hint="eastAsia"/>
+        </w:rPr>
+        <w:t xml:space="preserve">当前表；当</w:t>
+      </w:r>
+      <w:r>
+        <w:t xml:space="preserve"> HBase Thrift </w:t>
+      </w:r>
+      <w:r>
+        <w:rPr>
+          <w:rFonts w:hint="eastAsia"/>
+        </w:rPr>
+        <w:t xml:space="preserve">不可用时，回退到在线采集</w:t>
+      </w:r>
+      <w:r>
+        <w:t xml:space="preserve"> </w:t>
+      </w:r>
+      <w:r>
+        <w:rPr>
+          <w:rFonts w:hint="eastAsia"/>
+        </w:rPr>
+        <w:t xml:space="preserve">CSV，再回退到本地合并</w:t>
+      </w:r>
+      <w:r>
+        <w:t xml:space="preserve"> </w:t>
+      </w:r>
+      <w:r>
+        <w:rPr>
+          <w:rFonts w:hint="eastAsia"/>
+        </w:rPr>
+        <w:t xml:space="preserve">JSON，从而保证演示环境和开发环境都可运行。</w:t>
       </w:r>
     </w:p>
     <w:tbl>
@@ -4340,8 +5313,8 @@
         <w:t xml:space="preserve">条记录。</w:t>
       </w:r>
     </w:p>
-    <w:bookmarkEnd w:id="19"/>
-    <w:bookmarkStart w:id="29" w:name="六next.js-可视化实现"/>
+    <w:bookmarkEnd w:id="20"/>
+    <w:bookmarkStart w:id="30" w:name="六next.js-可视化实现"/>
     <w:p>
       <w:pPr>
         <w:pStyle w:val="Heading2"/>
@@ -4550,18 +5523,18 @@
           <wp:inline>
             <wp:extent cx="5334000" cy="3881966"/>
             <wp:effectExtent b="0" l="0" r="0" t="0"/>
-            <wp:docPr descr="" title="" id="21" name="Picture"/>
+            <wp:docPr descr="" title="" id="22" name="Picture"/>
             <a:graphic>
               <a:graphicData uri="http://schemas.openxmlformats.org/drawingml/2006/picture">
                 <pic:pic>
                   <pic:nvPicPr>
-                    <pic:cNvPr descr="reports/assets/web_next_overview.png" id="22" name="Picture"/>
+                    <pic:cNvPr descr="reports/assets/web_next_overview.png" id="23" name="Picture"/>
                     <pic:cNvPicPr>
                       <a:picLocks noChangeArrowheads="1" noChangeAspect="1"/>
                     </pic:cNvPicPr>
                   </pic:nvPicPr>
                   <pic:blipFill>
-                    <a:blip r:embed="rId20"/>
+                    <a:blip r:embed="rId21"/>
                     <a:stretch>
                       <a:fillRect/>
                     </a:stretch>
@@ -4624,52 +5597,7 @@
         <w:rPr>
           <w:rFonts w:hint="eastAsia"/>
         </w:rPr>
-        <w:t xml:space="preserve">总览页以地图为第一视觉层，三个站点点位可点击切换。唐山站当前读数显示温度</w:t>
-      </w:r>
-      <w:r>
-        <w:t xml:space="preserve"> 23 </w:t>
-      </w:r>
-      <w:r>
-        <w:rPr>
-          <w:rFonts w:hint="eastAsia"/>
-        </w:rPr>
-        <w:t xml:space="preserve">摄氏度、湿度</w:t>
-      </w:r>
-      <w:r>
-        <w:t xml:space="preserve"> </w:t>
-      </w:r>
-      <w:r>
-        <w:rPr>
-          <w:rFonts w:hint="eastAsia"/>
-        </w:rPr>
-        <w:t xml:space="preserve">43%、气压</w:t>
-      </w:r>
-      <w:r>
-        <w:t xml:space="preserve"> 1000.3 </w:t>
-      </w:r>
-      <w:r>
-        <w:rPr>
-          <w:rFonts w:hint="eastAsia"/>
-        </w:rPr>
-        <w:t xml:space="preserve">hPa、风速</w:t>
-      </w:r>
-      <w:r>
-        <w:t xml:space="preserve"> 2.8 </w:t>
-      </w:r>
-      <w:r>
-        <w:rPr>
-          <w:rFonts w:hint="eastAsia"/>
-        </w:rPr>
-        <w:t xml:space="preserve">m/s、风向</w:t>
-      </w:r>
-      <w:r>
-        <w:t xml:space="preserve"> 159 deg </w:t>
-      </w:r>
-      <w:r>
-        <w:rPr>
-          <w:rFonts w:hint="eastAsia"/>
-        </w:rPr>
-        <w:t xml:space="preserve">SSE，数据来源标记为</w:t>
+        <w:t xml:space="preserve">总览页以地图为第一视觉层，三个站点点位可点击切换。唐山站当前读数显示温度、湿度、气压、风速和风向，数据来源标记为</w:t>
       </w:r>
       <w:r>
         <w:t xml:space="preserve"> </w:t>
@@ -4681,7 +5609,53 @@
         <w:t xml:space="preserve">ESP32 + Open-Meteo</w:t>
       </w:r>
       <w:r>
-        <w:t xml:space="preserve">。</w:t>
+        <w:rPr>
+          <w:rFonts w:hint="eastAsia"/>
+        </w:rPr>
+        <w:t xml:space="preserve">。页面额外显示</w:t>
+      </w:r>
+      <w:r>
+        <w:t xml:space="preserve"> </w:t>
+      </w:r>
+      <w:r>
+        <w:rPr>
+          <w:rStyle w:val="VerbatimChar"/>
+        </w:rPr>
+        <w:t xml:space="preserve">ESP32 </w:t>
+      </w:r>
+      <w:r>
+        <w:rPr>
+          <w:rStyle w:val="VerbatimChar"/>
+          <w:rFonts w:hint="eastAsia"/>
+        </w:rPr>
+        <w:t xml:space="preserve">实时采样</w:t>
+      </w:r>
+      <w:r>
+        <w:t xml:space="preserve"> </w:t>
+      </w:r>
+      <w:r>
+        <w:rPr>
+          <w:rFonts w:hint="eastAsia"/>
+        </w:rPr>
+        <w:t xml:space="preserve">区块，包含最新采样时间、样本号、近</w:t>
+      </w:r>
+      <w:r>
+        <w:t xml:space="preserve"> 5 </w:t>
+      </w:r>
+      <w:r>
+        <w:rPr>
+          <w:rFonts w:hint="eastAsia"/>
+        </w:rPr>
+        <w:t xml:space="preserve">分钟记录数和最近若干条温湿度，自动刷新周期为</w:t>
+      </w:r>
+      <w:r>
+        <w:t xml:space="preserve"> 1 </w:t>
+      </w:r>
+      <w:r>
+        <w:rPr>
+          <w:rFonts w:hint="eastAsia"/>
+        </w:rPr>
+        <w:t xml:space="preserve">秒。</w:t>
       </w:r>
     </w:p>
     <w:p>
@@ -4693,18 +5667,18 @@
           <wp:inline>
             <wp:extent cx="5334000" cy="12223750"/>
             <wp:effectExtent b="0" l="0" r="0" t="0"/>
-            <wp:docPr descr="" title="" id="24" name="Picture"/>
+            <wp:docPr descr="" title="" id="25" name="Picture"/>
             <a:graphic>
               <a:graphicData uri="http://schemas.openxmlformats.org/drawingml/2006/picture">
                 <pic:pic>
                   <pic:nvPicPr>
-                    <pic:cNvPr descr="reports/assets/web_next_detail.png" id="25" name="Picture"/>
+                    <pic:cNvPr descr="reports/assets/web_next_detail.png" id="26" name="Picture"/>
                     <pic:cNvPicPr>
                       <a:picLocks noChangeArrowheads="1" noChangeAspect="1"/>
                     </pic:cNvPicPr>
                   </pic:nvPicPr>
                   <pic:blipFill>
-                    <a:blip r:embed="rId23"/>
+                    <a:blip r:embed="rId24"/>
                     <a:stretch>
                       <a:fillRect/>
                     </a:stretch>
@@ -4776,7 +5750,38 @@
         <w:rPr>
           <w:rFonts w:hint="eastAsia"/>
         </w:rPr>
-        <w:t xml:space="preserve">绘制温湿度趋势、风况趋势和多站同指标对比。下方统计摘要展示三站记录数、均温、均湿和温度范围，记录表展示当前站点最近</w:t>
+        <w:t xml:space="preserve">绘制温湿度趋势、风况趋势和多站同指标对比。下方统计摘要展示三站记录数、均温、均湿和温度范围；</w:t>
+      </w:r>
+      <w:r>
+        <w:rPr>
+          <w:rStyle w:val="VerbatimChar"/>
+        </w:rPr>
+        <w:t xml:space="preserve">ESP32 </w:t>
+      </w:r>
+      <w:r>
+        <w:rPr>
+          <w:rStyle w:val="VerbatimChar"/>
+          <w:rFonts w:hint="eastAsia"/>
+        </w:rPr>
+        <w:t xml:space="preserve">实时采样</w:t>
+      </w:r>
+      <w:r>
+        <w:t xml:space="preserve"> </w:t>
+      </w:r>
+      <w:r>
+        <w:rPr>
+          <w:rFonts w:hint="eastAsia"/>
+        </w:rPr>
+        <w:t xml:space="preserve">区块展示最近</w:t>
+      </w:r>
+      <w:r>
+        <w:t xml:space="preserve"> TCP </w:t>
+      </w:r>
+      <w:r>
+        <w:rPr>
+          <w:rFonts w:hint="eastAsia"/>
+        </w:rPr>
+        <w:t xml:space="preserve">采集记录和样本号，记录表展示当前站点最近</w:t>
       </w:r>
       <w:r>
         <w:t xml:space="preserve"> 48 </w:t>
@@ -4797,18 +5802,18 @@
           <wp:inline>
             <wp:extent cx="4953000" cy="19507200"/>
             <wp:effectExtent b="0" l="0" r="0" t="0"/>
-            <wp:docPr descr="" title="" id="27" name="Picture"/>
+            <wp:docPr descr="" title="" id="28" name="Picture"/>
             <a:graphic>
               <a:graphicData uri="http://schemas.openxmlformats.org/drawingml/2006/picture">
                 <pic:pic>
                   <pic:nvPicPr>
-                    <pic:cNvPr descr="reports/assets/web_next_mobile.png" id="28" name="Picture"/>
+                    <pic:cNvPr descr="reports/assets/web_next_mobile.png" id="29" name="Picture"/>
                     <pic:cNvPicPr>
                       <a:picLocks noChangeArrowheads="1" noChangeAspect="1"/>
                     </pic:cNvPicPr>
                   </pic:nvPicPr>
                   <pic:blipFill>
-                    <a:blip r:embed="rId26"/>
+                    <a:blip r:embed="rId27"/>
                     <a:stretch>
                       <a:fillRect/>
                     </a:stretch>
@@ -4874,8 +5879,8 @@
         <w:t xml:space="preserve">窄屏下，页签、刷新按钮、地图、指标卡均改为单列布局。站点标签经过单独位置调整，避免唐山、北京点位接近时标签重叠或被裁切。</w:t>
       </w:r>
     </w:p>
-    <w:bookmarkEnd w:id="29"/>
-    <w:bookmarkStart w:id="30" w:name="七运行与验收"/>
+    <w:bookmarkEnd w:id="30"/>
+    <w:bookmarkStart w:id="31" w:name="七运行与验收"/>
     <w:p>
       <w:pPr>
         <w:pStyle w:val="Heading2"/>
@@ -5046,24 +6051,30 @@
               <w:rPr>
                 <w:rFonts w:hint="eastAsia"/>
               </w:rPr>
-              <w:t xml:space="preserve">本地历史数据</w:t>
-            </w:r>
-          </w:p>
-        </w:tc>
-        <w:tc>
-          <w:tcPr/>
-          <w:p>
-            <w:pPr>
-              <w:pStyle w:val="Compact"/>
-            </w:pPr>
-            <w:r>
-              <w:t xml:space="preserve">504 </w:t>
-            </w:r>
-            <w:r>
-              <w:rPr>
-                <w:rFonts w:hint="eastAsia"/>
-              </w:rPr>
-              <w:t xml:space="preserve">条</w:t>
+              <w:t xml:space="preserve">设计覆盖入口</w:t>
+            </w:r>
+          </w:p>
+        </w:tc>
+        <w:tc>
+          <w:tcPr/>
+          <w:p>
+            <w:pPr>
+              <w:pStyle w:val="Compact"/>
+            </w:pPr>
+            <w:r>
+              <w:rPr>
+                <w:rStyle w:val="VerbatimChar"/>
+              </w:rPr>
+              <w:t xml:space="preserve">verify-design-coverage.sh</w:t>
+            </w:r>
+            <w:r>
+              <w:t xml:space="preserve"> </w:t>
+            </w:r>
+            <w:r>
+              <w:rPr>
+                <w:rFonts w:hint="eastAsia"/>
+              </w:rPr>
+              <w:t xml:space="preserve">通过</w:t>
             </w:r>
           </w:p>
         </w:tc>
@@ -5079,24 +6090,24 @@
               <w:rPr>
                 <w:rFonts w:hint="eastAsia"/>
               </w:rPr>
-              <w:t xml:space="preserve">当前站点数据</w:t>
-            </w:r>
-          </w:p>
-        </w:tc>
-        <w:tc>
-          <w:tcPr/>
-          <w:p>
-            <w:pPr>
-              <w:pStyle w:val="Compact"/>
-            </w:pPr>
-            <w:r>
-              <w:t xml:space="preserve">3 </w:t>
-            </w:r>
-            <w:r>
-              <w:rPr>
-                <w:rFonts w:hint="eastAsia"/>
-              </w:rPr>
-              <w:t xml:space="preserve">个站点</w:t>
+              <w:t xml:space="preserve">本地历史数据</w:t>
+            </w:r>
+          </w:p>
+        </w:tc>
+        <w:tc>
+          <w:tcPr/>
+          <w:p>
+            <w:pPr>
+              <w:pStyle w:val="Compact"/>
+            </w:pPr>
+            <w:r>
+              <w:t xml:space="preserve">504 </w:t>
+            </w:r>
+            <w:r>
+              <w:rPr>
+                <w:rFonts w:hint="eastAsia"/>
+              </w:rPr>
+              <w:t xml:space="preserve">条</w:t>
             </w:r>
           </w:p>
         </w:tc>
@@ -5109,36 +6120,27 @@
               <w:pStyle w:val="Compact"/>
             </w:pPr>
             <w:r>
-              <w:t xml:space="preserve">HDFS </w:t>
-            </w:r>
-            <w:r>
-              <w:rPr>
-                <w:rFonts w:hint="eastAsia"/>
-              </w:rPr>
-              <w:t xml:space="preserve">输入</w:t>
-            </w:r>
-          </w:p>
-        </w:tc>
-        <w:tc>
-          <w:tcPr/>
-          <w:p>
-            <w:pPr>
-              <w:pStyle w:val="Compact"/>
-            </w:pPr>
-            <w:r>
-              <w:rPr>
-                <w:rStyle w:val="VerbatimChar"/>
-              </w:rPr>
-              <w:t xml:space="preserve">/weathertextdb/weather_observations.csv</w:t>
-            </w:r>
-            <w:r>
-              <w:t xml:space="preserve"> </w:t>
-            </w:r>
-            <w:r>
-              <w:rPr>
-                <w:rFonts w:hint="eastAsia"/>
-              </w:rPr>
-              <w:t xml:space="preserve">存在</w:t>
+              <w:rPr>
+                <w:rFonts w:hint="eastAsia"/>
+              </w:rPr>
+              <w:t xml:space="preserve">当前站点数据</w:t>
+            </w:r>
+          </w:p>
+        </w:tc>
+        <w:tc>
+          <w:tcPr/>
+          <w:p>
+            <w:pPr>
+              <w:pStyle w:val="Compact"/>
+            </w:pPr>
+            <w:r>
+              <w:t xml:space="preserve">3 </w:t>
+            </w:r>
+            <w:r>
+              <w:rPr>
+                <w:rFonts w:hint="eastAsia"/>
+              </w:rPr>
+              <w:t xml:space="preserve">个站点</w:t>
             </w:r>
           </w:p>
         </w:tc>
@@ -5151,13 +6153,13 @@
               <w:pStyle w:val="Compact"/>
             </w:pPr>
             <w:r>
-              <w:t xml:space="preserve">Spark </w:t>
-            </w:r>
-            <w:r>
-              <w:rPr>
-                <w:rFonts w:hint="eastAsia"/>
-              </w:rPr>
-              <w:t xml:space="preserve">输出</w:t>
+              <w:t xml:space="preserve">HDFS </w:t>
+            </w:r>
+            <w:r>
+              <w:rPr>
+                <w:rFonts w:hint="eastAsia"/>
+              </w:rPr>
+              <w:t xml:space="preserve">输入</w:t>
             </w:r>
           </w:p>
         </w:tc>
@@ -5171,16 +6173,7 @@
               <w:rPr>
                 <w:rStyle w:val="VerbatimChar"/>
               </w:rPr>
-              <w:t xml:space="preserve">/weather_analysis/summary</w:t>
-            </w:r>
-            <w:r>
-              <w:t xml:space="preserve">、</w:t>
-            </w:r>
-            <w:r>
-              <w:rPr>
-                <w:rStyle w:val="VerbatimChar"/>
-              </w:rPr>
-              <w:t xml:space="preserve">/weather_analysis/window_mean</w:t>
+              <w:t xml:space="preserve">/weathertextdb/weather_observations.csv</w:t>
             </w:r>
             <w:r>
               <w:t xml:space="preserve"> </w:t>
@@ -5202,36 +6195,45 @@
               <w:pStyle w:val="Compact"/>
             </w:pPr>
             <w:r>
-              <w:t xml:space="preserve">Hive </w:t>
-            </w:r>
-            <w:r>
-              <w:rPr>
-                <w:rFonts w:hint="eastAsia"/>
-              </w:rPr>
-              <w:t xml:space="preserve">查询</w:t>
-            </w:r>
-          </w:p>
-        </w:tc>
-        <w:tc>
-          <w:tcPr/>
-          <w:p>
-            <w:pPr>
-              <w:pStyle w:val="Compact"/>
-            </w:pPr>
-            <w:r>
-              <w:rPr>
-                <w:rFonts w:hint="eastAsia"/>
-              </w:rPr>
-              <w:t xml:space="preserve">三站各</w:t>
-            </w:r>
-            <w:r>
-              <w:t xml:space="preserve"> 168 </w:t>
-            </w:r>
-            <w:r>
-              <w:rPr>
-                <w:rFonts w:hint="eastAsia"/>
-              </w:rPr>
-              <w:t xml:space="preserve">条</w:t>
+              <w:t xml:space="preserve">Spark </w:t>
+            </w:r>
+            <w:r>
+              <w:rPr>
+                <w:rFonts w:hint="eastAsia"/>
+              </w:rPr>
+              <w:t xml:space="preserve">输出</w:t>
+            </w:r>
+          </w:p>
+        </w:tc>
+        <w:tc>
+          <w:tcPr/>
+          <w:p>
+            <w:pPr>
+              <w:pStyle w:val="Compact"/>
+            </w:pPr>
+            <w:r>
+              <w:rPr>
+                <w:rStyle w:val="VerbatimChar"/>
+              </w:rPr>
+              <w:t xml:space="preserve">/weather_analysis/summary</w:t>
+            </w:r>
+            <w:r>
+              <w:t xml:space="preserve">、</w:t>
+            </w:r>
+            <w:r>
+              <w:rPr>
+                <w:rStyle w:val="VerbatimChar"/>
+              </w:rPr>
+              <w:t xml:space="preserve">/weather_analysis/window_mean</w:t>
+            </w:r>
+            <w:r>
+              <w:t xml:space="preserve">、</w:t>
+            </w:r>
+            <w:r>
+              <w:rPr>
+                <w:rStyle w:val="VerbatimChar"/>
+              </w:rPr>
+              <w:t xml:space="preserve">/weather_10secmean</w:t>
             </w:r>
           </w:p>
         </w:tc>
@@ -5244,39 +6246,36 @@
               <w:pStyle w:val="Compact"/>
             </w:pPr>
             <w:r>
-              <w:t xml:space="preserve">HBase scan</w:t>
-            </w:r>
-          </w:p>
-        </w:tc>
-        <w:tc>
-          <w:tcPr/>
-          <w:p>
-            <w:pPr>
-              <w:pStyle w:val="Compact"/>
-            </w:pPr>
-            <w:r>
-              <w:rPr>
-                <w:rStyle w:val="VerbatimChar"/>
-              </w:rPr>
-              <w:t xml:space="preserve">realtime_weather</w:t>
-            </w:r>
-            <w:r>
-              <w:t xml:space="preserve"> </w:t>
-            </w:r>
-            <w:r>
-              <w:rPr>
-                <w:rFonts w:hint="eastAsia"/>
-              </w:rPr>
-              <w:t xml:space="preserve">返回</w:t>
-            </w:r>
-            <w:r>
-              <w:t xml:space="preserve"> 3 </w:t>
-            </w:r>
-            <w:r>
-              <w:rPr>
-                <w:rFonts w:hint="eastAsia"/>
-              </w:rPr>
-              <w:t xml:space="preserve">行</w:t>
+              <w:t xml:space="preserve">Hive </w:t>
+            </w:r>
+            <w:r>
+              <w:rPr>
+                <w:rFonts w:hint="eastAsia"/>
+              </w:rPr>
+              <w:t xml:space="preserve">查询</w:t>
+            </w:r>
+          </w:p>
+        </w:tc>
+        <w:tc>
+          <w:tcPr/>
+          <w:p>
+            <w:pPr>
+              <w:pStyle w:val="Compact"/>
+            </w:pPr>
+            <w:r>
+              <w:rPr>
+                <w:rFonts w:hint="eastAsia"/>
+              </w:rPr>
+              <w:t xml:space="preserve">三站各</w:t>
+            </w:r>
+            <w:r>
+              <w:t xml:space="preserve"> 168 </w:t>
+            </w:r>
+            <w:r>
+              <w:rPr>
+                <w:rFonts w:hint="eastAsia"/>
+              </w:rPr>
+              <w:t xml:space="preserve">条</w:t>
             </w:r>
           </w:p>
         </w:tc>
@@ -5289,27 +6288,39 @@
               <w:pStyle w:val="Compact"/>
             </w:pPr>
             <w:r>
-              <w:t xml:space="preserve">FastAPI </w:t>
-            </w:r>
-            <w:r>
-              <w:rPr>
-                <w:rFonts w:hint="eastAsia"/>
-              </w:rPr>
-              <w:t xml:space="preserve">当前/摘要/趋势接口</w:t>
-            </w:r>
-          </w:p>
-        </w:tc>
-        <w:tc>
-          <w:tcPr/>
-          <w:p>
-            <w:pPr>
-              <w:pStyle w:val="Compact"/>
-            </w:pPr>
-            <w:r>
-              <w:rPr>
-                <w:rFonts w:hint="eastAsia"/>
-              </w:rPr>
-              <w:t xml:space="preserve">通过</w:t>
+              <w:t xml:space="preserve">HBase scan</w:t>
+            </w:r>
+          </w:p>
+        </w:tc>
+        <w:tc>
+          <w:tcPr/>
+          <w:p>
+            <w:pPr>
+              <w:pStyle w:val="Compact"/>
+            </w:pPr>
+            <w:r>
+              <w:rPr>
+                <w:rStyle w:val="VerbatimChar"/>
+              </w:rPr>
+              <w:t xml:space="preserve">realtime_weather</w:t>
+            </w:r>
+            <w:r>
+              <w:t xml:space="preserve"> </w:t>
+            </w:r>
+            <w:r>
+              <w:rPr>
+                <w:rFonts w:hint="eastAsia"/>
+              </w:rPr>
+              <w:t xml:space="preserve">返回实时记录，列族</w:t>
+            </w:r>
+            <w:r>
+              <w:t xml:space="preserve"> TTL 150 </w:t>
+            </w:r>
+            <w:r>
+              <w:rPr>
+                <w:rFonts w:hint="eastAsia"/>
+              </w:rPr>
+              <w:t xml:space="preserve">秒</w:t>
             </w:r>
           </w:p>
         </w:tc>
@@ -5322,30 +6333,27 @@
               <w:pStyle w:val="Compact"/>
             </w:pPr>
             <w:r>
-              <w:t xml:space="preserve">Next.js </w:t>
-            </w:r>
-            <w:r>
-              <w:rPr>
-                <w:rFonts w:hint="eastAsia"/>
-              </w:rPr>
-              <w:t xml:space="preserve">页签</w:t>
-            </w:r>
-          </w:p>
-        </w:tc>
-        <w:tc>
-          <w:tcPr/>
-          <w:p>
-            <w:pPr>
-              <w:pStyle w:val="Compact"/>
-            </w:pPr>
-            <w:r>
-              <w:t xml:space="preserve">2 </w:t>
-            </w:r>
-            <w:r>
-              <w:rPr>
-                <w:rFonts w:hint="eastAsia"/>
-              </w:rPr>
-              <w:t xml:space="preserve">个</w:t>
+              <w:t xml:space="preserve">FastAPI </w:t>
+            </w:r>
+            <w:r>
+              <w:rPr>
+                <w:rFonts w:hint="eastAsia"/>
+              </w:rPr>
+              <w:t xml:space="preserve">当前/摘要/趋势接口</w:t>
+            </w:r>
+          </w:p>
+        </w:tc>
+        <w:tc>
+          <w:tcPr/>
+          <w:p>
+            <w:pPr>
+              <w:pStyle w:val="Compact"/>
+            </w:pPr>
+            <w:r>
+              <w:rPr>
+                <w:rFonts w:hint="eastAsia"/>
+              </w:rPr>
+              <w:t xml:space="preserve">通过</w:t>
             </w:r>
           </w:p>
         </w:tc>
@@ -5358,21 +6366,24 @@
               <w:pStyle w:val="Compact"/>
             </w:pPr>
             <w:r>
-              <w:rPr>
-                <w:rFonts w:hint="eastAsia"/>
-              </w:rPr>
-              <w:t xml:space="preserve">站点点位</w:t>
-            </w:r>
-          </w:p>
-        </w:tc>
-        <w:tc>
-          <w:tcPr/>
-          <w:p>
-            <w:pPr>
-              <w:pStyle w:val="Compact"/>
-            </w:pPr>
-            <w:r>
-              <w:t xml:space="preserve">3 </w:t>
+              <w:t xml:space="preserve">Next.js </w:t>
+            </w:r>
+            <w:r>
+              <w:rPr>
+                <w:rFonts w:hint="eastAsia"/>
+              </w:rPr>
+              <w:t xml:space="preserve">页签</w:t>
+            </w:r>
+          </w:p>
+        </w:tc>
+        <w:tc>
+          <w:tcPr/>
+          <w:p>
+            <w:pPr>
+              <w:pStyle w:val="Compact"/>
+            </w:pPr>
+            <w:r>
+              <w:t xml:space="preserve">2 </w:t>
             </w:r>
             <w:r>
               <w:rPr>
@@ -5391,13 +6402,10 @@
               <w:pStyle w:val="Compact"/>
             </w:pPr>
             <w:r>
-              <w:t xml:space="preserve">Recharts </w:t>
-            </w:r>
-            <w:r>
-              <w:rPr>
-                <w:rFonts w:hint="eastAsia"/>
-              </w:rPr>
-              <w:t xml:space="preserve">图表</w:t>
+              <w:rPr>
+                <w:rFonts w:hint="eastAsia"/>
+              </w:rPr>
+              <w:t xml:space="preserve">站点点位</w:t>
             </w:r>
           </w:p>
         </w:tc>
@@ -5427,27 +6435,30 @@
               <w:pStyle w:val="Compact"/>
             </w:pPr>
             <w:r>
-              <w:rPr>
-                <w:rFonts w:hint="eastAsia"/>
-              </w:rPr>
-              <w:t xml:space="preserve">记录表</w:t>
-            </w:r>
-          </w:p>
-        </w:tc>
-        <w:tc>
-          <w:tcPr/>
-          <w:p>
-            <w:pPr>
-              <w:pStyle w:val="Compact"/>
-            </w:pPr>
-            <w:r>
-              <w:t xml:space="preserve">48 </w:t>
-            </w:r>
-            <w:r>
-              <w:rPr>
-                <w:rFonts w:hint="eastAsia"/>
-              </w:rPr>
-              <w:t xml:space="preserve">行</w:t>
+              <w:t xml:space="preserve">Recharts </w:t>
+            </w:r>
+            <w:r>
+              <w:rPr>
+                <w:rFonts w:hint="eastAsia"/>
+              </w:rPr>
+              <w:t xml:space="preserve">图表</w:t>
+            </w:r>
+          </w:p>
+        </w:tc>
+        <w:tc>
+          <w:tcPr/>
+          <w:p>
+            <w:pPr>
+              <w:pStyle w:val="Compact"/>
+            </w:pPr>
+            <w:r>
+              <w:t xml:space="preserve">3 </w:t>
+            </w:r>
+            <w:r>
+              <w:rPr>
+                <w:rFonts w:hint="eastAsia"/>
+              </w:rPr>
+              <w:t xml:space="preserve">个</w:t>
             </w:r>
           </w:p>
         </w:tc>
@@ -5463,6 +6474,39 @@
               <w:rPr>
                 <w:rFonts w:hint="eastAsia"/>
               </w:rPr>
+              <w:t xml:space="preserve">记录表</w:t>
+            </w:r>
+          </w:p>
+        </w:tc>
+        <w:tc>
+          <w:tcPr/>
+          <w:p>
+            <w:pPr>
+              <w:pStyle w:val="Compact"/>
+            </w:pPr>
+            <w:r>
+              <w:t xml:space="preserve">48 </w:t>
+            </w:r>
+            <w:r>
+              <w:rPr>
+                <w:rFonts w:hint="eastAsia"/>
+              </w:rPr>
+              <w:t xml:space="preserve">行</w:t>
+            </w:r>
+          </w:p>
+        </w:tc>
+      </w:tr>
+      <w:tr>
+        <w:tc>
+          <w:tcPr/>
+          <w:p>
+            <w:pPr>
+              <w:pStyle w:val="Compact"/>
+            </w:pPr>
+            <w:r>
+              <w:rPr>
+                <w:rFonts w:hint="eastAsia"/>
+              </w:rPr>
               <w:t xml:space="preserve">浏览器控制台错误</w:t>
             </w:r>
           </w:p>
@@ -5486,8 +6530,8 @@
         </w:tc>
       </w:tr>
     </w:tbl>
-    <w:bookmarkEnd w:id="30"/>
-    <w:bookmarkStart w:id="31" w:name="八结论与限制"/>
+    <w:bookmarkEnd w:id="31"/>
+    <w:bookmarkStart w:id="32" w:name="八结论与限制"/>
     <w:p>
       <w:pPr>
         <w:pStyle w:val="Heading2"/>
@@ -5507,7 +6551,298 @@
         <w:rPr>
           <w:rFonts w:hint="eastAsia"/>
         </w:rPr>
-        <w:t xml:space="preserve">本项目已经按设计文档完成除</w:t>
+        <w:t xml:space="preserve">本项目已经按设计文档补齐主要能力：ESP32</w:t>
+      </w:r>
+      <w:r>
+        <w:t xml:space="preserve"> </w:t>
+      </w:r>
+      <w:r>
+        <w:rPr>
+          <w:rFonts w:hint="eastAsia"/>
+        </w:rPr>
+        <w:t xml:space="preserve">气象站脚本、在线采集服务、HBase/HDFS</w:t>
+      </w:r>
+      <w:r>
+        <w:t xml:space="preserve"> </w:t>
+      </w:r>
+      <w:r>
+        <w:rPr>
+          <w:rFonts w:hint="eastAsia"/>
+        </w:rPr>
+        <w:t xml:space="preserve">双写、Hive</w:t>
+      </w:r>
+      <w:r>
+        <w:t xml:space="preserve"> </w:t>
+      </w:r>
+      <w:r>
+        <w:rPr>
+          <w:rFonts w:hint="eastAsia"/>
+        </w:rPr>
+        <w:t xml:space="preserve">表、Spark</w:t>
+      </w:r>
+      <w:r>
+        <w:t xml:space="preserve"> on YARN 10 </w:t>
+      </w:r>
+      <w:r>
+        <w:rPr>
+          <w:rFonts w:hint="eastAsia"/>
+        </w:rPr>
+        <w:t xml:space="preserve">秒窗口均值、FastAPI</w:t>
+      </w:r>
+      <w:r>
+        <w:t xml:space="preserve"> </w:t>
+      </w:r>
+      <w:r>
+        <w:rPr>
+          <w:rFonts w:hint="eastAsia"/>
+        </w:rPr>
+        <w:t xml:space="preserve">数据接口和</w:t>
+      </w:r>
+      <w:r>
+        <w:t xml:space="preserve"> Next.js </w:t>
+      </w:r>
+      <w:r>
+        <w:rPr>
+          <w:rFonts w:hint="eastAsia"/>
+        </w:rPr>
+        <w:t xml:space="preserve">可视化。大数据链路使用</w:t>
+      </w:r>
+      <w:r>
+        <w:t xml:space="preserve"> </w:t>
+      </w:r>
+      <w:r>
+        <w:rPr>
+          <w:rStyle w:val="VerbatimChar"/>
+        </w:rPr>
+        <w:t xml:space="preserve">/weathertextdb</w:t>
+      </w:r>
+      <w:r>
+        <w:t xml:space="preserve">、</w:t>
+      </w:r>
+      <w:r>
+        <w:rPr>
+          <w:rStyle w:val="VerbatimChar"/>
+        </w:rPr>
+        <w:t xml:space="preserve">weather_table</w:t>
+      </w:r>
+      <w:r>
+        <w:t xml:space="preserve">、</w:t>
+      </w:r>
+      <w:r>
+        <w:rPr>
+          <w:rStyle w:val="VerbatimChar"/>
+        </w:rPr>
+        <w:t xml:space="preserve">realtime_weather</w:t>
+      </w:r>
+      <w:r>
+        <w:t xml:space="preserve">、</w:t>
+      </w:r>
+      <w:r>
+        <w:rPr>
+          <w:rStyle w:val="VerbatimChar"/>
+        </w:rPr>
+        <w:t xml:space="preserve">/weather_analysis/*</w:t>
+      </w:r>
+      <w:r>
+        <w:t xml:space="preserve"> </w:t>
+      </w:r>
+      <w:r>
+        <w:rPr>
+          <w:rFonts w:hint="eastAsia"/>
+        </w:rPr>
+        <w:t xml:space="preserve">和</w:t>
+      </w:r>
+      <w:r>
+        <w:t xml:space="preserve"> </w:t>
+      </w:r>
+      <w:r>
+        <w:rPr>
+          <w:rStyle w:val="VerbatimChar"/>
+        </w:rPr>
+        <w:t xml:space="preserve">/weather_10secmean</w:t>
+      </w:r>
+      <w:r>
+        <w:rPr>
+          <w:rFonts w:hint="eastAsia"/>
+        </w:rPr>
+        <w:t xml:space="preserve">；Web</w:t>
+      </w:r>
+      <w:r>
+        <w:t xml:space="preserve"> </w:t>
+      </w:r>
+      <w:r>
+        <w:rPr>
+          <w:rFonts w:hint="eastAsia"/>
+        </w:rPr>
+        <w:t xml:space="preserve">层改为</w:t>
+      </w:r>
+      <w:r>
+        <w:t xml:space="preserve"> FastAPI + </w:t>
+      </w:r>
+      <w:r>
+        <w:rPr>
+          <w:rFonts w:hint="eastAsia"/>
+        </w:rPr>
+        <w:t xml:space="preserve">Next.js，前端不再使用静态</w:t>
+      </w:r>
+      <w:r>
+        <w:t xml:space="preserve"> </w:t>
+      </w:r>
+      <w:r>
+        <w:rPr>
+          <w:rFonts w:hint="eastAsia"/>
+        </w:rPr>
+        <w:t xml:space="preserve">HTML/Canvas，也不再保留设计文档以外的多余实现页面。</w:t>
+      </w:r>
+    </w:p>
+    <w:p>
+      <w:pPr>
+        <w:pStyle w:val="BodyText"/>
+      </w:pPr>
+      <w:r>
+        <w:rPr>
+          <w:rFonts w:hint="eastAsia"/>
+        </w:rPr>
+        <w:t xml:space="preserve">本次实机联调已经完成</w:t>
+      </w:r>
+      <w:r>
+        <w:t xml:space="preserve"> </w:t>
+      </w:r>
+      <w:r>
+        <w:rPr>
+          <w:rStyle w:val="VerbatimChar"/>
+        </w:rPr>
+        <w:t xml:space="preserve">ESP32 main.py -&gt; weather_dataserver.py -&gt; </w:t>
+      </w:r>
+      <w:r>
+        <w:rPr>
+          <w:rStyle w:val="VerbatimChar"/>
+          <w:rFonts w:hint="eastAsia"/>
+        </w:rPr>
+        <w:t xml:space="preserve">本地实时</w:t>
+      </w:r>
+      <w:r>
+        <w:rPr>
+          <w:rStyle w:val="VerbatimChar"/>
+        </w:rPr>
+        <w:t xml:space="preserve"> CSV -&gt; HDFS/HBase</w:t>
+      </w:r>
+      <w:r>
+        <w:t xml:space="preserve"> </w:t>
+      </w:r>
+      <w:r>
+        <w:rPr>
+          <w:rFonts w:hint="eastAsia"/>
+        </w:rPr>
+        <w:t xml:space="preserve">路径验证。ESP32</w:t>
+      </w:r>
+      <w:r>
+        <w:t xml:space="preserve"> </w:t>
+      </w:r>
+      <w:r>
+        <w:rPr>
+          <w:rFonts w:hint="eastAsia"/>
+        </w:rPr>
+        <w:t xml:space="preserve">在</w:t>
+      </w:r>
+      <w:r>
+        <w:t xml:space="preserve"> WPA2 </w:t>
+      </w:r>
+      <w:r>
+        <w:rPr>
+          <w:rFonts w:hint="eastAsia"/>
+        </w:rPr>
+        <w:t xml:space="preserve">手机热点</w:t>
+      </w:r>
+      <w:r>
+        <w:t xml:space="preserve"> </w:t>
+      </w:r>
+      <w:r>
+        <w:rPr>
+          <w:rStyle w:val="VerbatimChar"/>
+        </w:rPr>
+        <w:t xml:space="preserve">prometheus</w:t>
+      </w:r>
+      <w:r>
+        <w:t xml:space="preserve"> </w:t>
+      </w:r>
+      <w:r>
+        <w:rPr>
+          <w:rFonts w:hint="eastAsia"/>
+        </w:rPr>
+        <w:t xml:space="preserve">下使用密码</w:t>
+      </w:r>
+      <w:r>
+        <w:t xml:space="preserve"> </w:t>
+      </w:r>
+      <w:r>
+        <w:rPr>
+          <w:rStyle w:val="VerbatimChar"/>
+        </w:rPr>
+        <w:t xml:space="preserve">abcdefgh</w:t>
+      </w:r>
+      <w:r>
+        <w:t xml:space="preserve"> </w:t>
+      </w:r>
+      <w:r>
+        <w:rPr>
+          <w:rFonts w:hint="eastAsia"/>
+        </w:rPr>
+        <w:t xml:space="preserve">可连接并获得</w:t>
+      </w:r>
+      <w:r>
+        <w:t xml:space="preserve"> </w:t>
+      </w:r>
+      <w:r>
+        <w:rPr>
+          <w:rStyle w:val="VerbatimChar"/>
+        </w:rPr>
+        <w:t xml:space="preserve">172.21.7.75</w:t>
+      </w:r>
+      <w:r>
+        <w:rPr>
+          <w:rFonts w:hint="eastAsia"/>
+        </w:rPr>
+        <w:t xml:space="preserve">；连接过程中串口日志曾短暂出现</w:t>
+      </w:r>
+      <w:r>
+        <w:t xml:space="preserve"> </w:t>
+      </w:r>
+      <w:r>
+        <w:rPr>
+          <w:rStyle w:val="VerbatimChar"/>
+        </w:rPr>
+        <w:t xml:space="preserve">status=202</w:t>
+      </w:r>
+      <w:r>
+        <w:rPr>
+          <w:rFonts w:hint="eastAsia"/>
+        </w:rPr>
+        <w:t xml:space="preserve">，但随后正常进入</w:t>
+      </w:r>
+      <w:r>
+        <w:t xml:space="preserve"> </w:t>
+      </w:r>
+      <w:r>
+        <w:rPr>
+          <w:rStyle w:val="VerbatimChar"/>
+        </w:rPr>
+        <w:t xml:space="preserve">GOT_IP</w:t>
+      </w:r>
+      <w:r>
+        <w:rPr>
+          <w:rFonts w:hint="eastAsia"/>
+        </w:rPr>
+        <w:t xml:space="preserve">，因此调试时应以完整超时窗口后的最终状态为准。剩余风险主要是演示现场热点环境变化导致</w:t>
+      </w:r>
+      <w:r>
+        <w:t xml:space="preserve"> IP </w:t>
+      </w:r>
+      <w:r>
+        <w:rPr>
+          <w:rFonts w:hint="eastAsia"/>
+        </w:rPr>
+        <w:t xml:space="preserve">变化，展示前需要重新确认</w:t>
       </w:r>
       <w:r>
         <w:t xml:space="preserve"> ESP32 </w:t>
@@ -5516,145 +6851,20 @@
         <w:rPr>
           <w:rFonts w:hint="eastAsia"/>
         </w:rPr>
-        <w:t xml:space="preserve">实机复测外的主要设计与实现对齐。大数据链路使用</w:t>
-      </w:r>
-      <w:r>
-        <w:t xml:space="preserve"> </w:t>
-      </w:r>
-      <w:r>
-        <w:rPr>
-          <w:rStyle w:val="VerbatimChar"/>
-        </w:rPr>
-        <w:t xml:space="preserve">/weathertextdb</w:t>
-      </w:r>
-      <w:r>
-        <w:t xml:space="preserve">、</w:t>
-      </w:r>
-      <w:r>
-        <w:rPr>
-          <w:rStyle w:val="VerbatimChar"/>
-        </w:rPr>
-        <w:t xml:space="preserve">weather_table</w:t>
-      </w:r>
-      <w:r>
-        <w:t xml:space="preserve">、</w:t>
-      </w:r>
-      <w:r>
-        <w:rPr>
-          <w:rStyle w:val="VerbatimChar"/>
-        </w:rPr>
-        <w:t xml:space="preserve">realtime_weather</w:t>
-      </w:r>
-      <w:r>
-        <w:t xml:space="preserve"> </w:t>
-      </w:r>
-      <w:r>
-        <w:rPr>
-          <w:rFonts w:hint="eastAsia"/>
-        </w:rPr>
-        <w:t xml:space="preserve">和</w:t>
-      </w:r>
-      <w:r>
-        <w:t xml:space="preserve"> </w:t>
-      </w:r>
-      <w:r>
-        <w:rPr>
-          <w:rStyle w:val="VerbatimChar"/>
-        </w:rPr>
-        <w:t xml:space="preserve">/weather_analysis/*</w:t>
-      </w:r>
-      <w:r>
-        <w:rPr>
-          <w:rFonts w:hint="eastAsia"/>
-        </w:rPr>
-        <w:t xml:space="preserve">，不再使用旧的扩展路径和旧表名；Web</w:t>
-      </w:r>
-      <w:r>
-        <w:t xml:space="preserve"> </w:t>
-      </w:r>
-      <w:r>
-        <w:rPr>
-          <w:rFonts w:hint="eastAsia"/>
-        </w:rPr>
-        <w:t xml:space="preserve">层改为</w:t>
-      </w:r>
-      <w:r>
-        <w:t xml:space="preserve"> FastAPI + </w:t>
-      </w:r>
-      <w:r>
-        <w:rPr>
-          <w:rFonts w:hint="eastAsia"/>
-        </w:rPr>
-        <w:t xml:space="preserve">Next.js，前端不再使用静态</w:t>
-      </w:r>
-      <w:r>
-        <w:t xml:space="preserve"> </w:t>
-      </w:r>
-      <w:r>
-        <w:rPr>
-          <w:rFonts w:hint="eastAsia"/>
-        </w:rPr>
-        <w:t xml:space="preserve">HTML/Canvas，也不再保留设计文档以外的多余实现页面。</w:t>
-      </w:r>
-    </w:p>
-    <w:p>
-      <w:pPr>
-        <w:pStyle w:val="BodyText"/>
-      </w:pPr>
-      <w:r>
-        <w:rPr>
-          <w:rFonts w:hint="eastAsia"/>
-        </w:rPr>
-        <w:t xml:space="preserve">当前限制是本轮没有连接</w:t>
-      </w:r>
-      <w:r>
-        <w:t xml:space="preserve"> ESP32-C3 </w:t>
-      </w:r>
-      <w:r>
-        <w:rPr>
-          <w:rFonts w:hint="eastAsia"/>
-        </w:rPr>
-        <w:t xml:space="preserve">实机。报告中的唐山当前温湿度来自已有</w:t>
-      </w:r>
-      <w:r>
-        <w:t xml:space="preserve"> USB </w:t>
-      </w:r>
-      <w:r>
-        <w:rPr>
-          <w:rFonts w:hint="eastAsia"/>
-        </w:rPr>
-        <w:t xml:space="preserve">样本，不代表本轮现场采集。连接开发板后，应重新执行串口采集、合并当前数据、写入</w:t>
-      </w:r>
-      <w:r>
-        <w:t xml:space="preserve"> </w:t>
-      </w:r>
-      <w:r>
-        <w:rPr>
-          <w:rFonts w:hint="eastAsia"/>
-        </w:rPr>
-        <w:t xml:space="preserve">HBase，并再次运行</w:t>
-      </w:r>
-      <w:r>
-        <w:t xml:space="preserve"> </w:t>
-      </w:r>
-      <w:r>
-        <w:rPr>
-          <w:rStyle w:val="VerbatimChar"/>
-        </w:rPr>
-        <w:t xml:space="preserve">./scripts/verify-full.sh</w:t>
-      </w:r>
-      <w:r>
-        <w:t xml:space="preserve"> </w:t>
-      </w:r>
-      <w:r>
-        <w:rPr>
-          <w:rFonts w:hint="eastAsia"/>
-        </w:rPr>
-        <w:t xml:space="preserve">完成最终实机验收。</w:t>
-      </w:r>
-    </w:p>
-    <w:bookmarkEnd w:id="31"/>
+        <w:t xml:space="preserve">串口日志中的</w:t>
+      </w:r>
+      <w:r>
+        <w:t xml:space="preserve"> IP </w:t>
+      </w:r>
+      <w:r>
+        <w:rPr>
+          <w:rFonts w:hint="eastAsia"/>
+        </w:rPr>
+        <w:t xml:space="preserve">地址。</w:t>
+      </w:r>
+    </w:p>
     <w:bookmarkEnd w:id="32"/>
+    <w:bookmarkEnd w:id="33"/>
     <w:sectPr>
       <w:footnotePr>
         <w:numRestart w:val="eachSect"/>

</xml_diff>